<commit_message>
style: convert entire project typography to official AWS Amazon Ember font
</commit_message>
<xml_diff>
--- a/Intelligent_EV_Charging_System_Documentation.docx
+++ b/Intelligent_EV_Charging_System_Documentation.docx
@@ -8,7 +8,7 @@
       </w:pPr>
       <w:r>
         <w:rPr>
-          <w:rFonts w:ascii="Arial" w:hAnsi="Arial"/>
+          <w:rFonts w:ascii="Amazon Ember" w:hAnsi="Amazon Ember"/>
           <w:b/>
           <w:color w:val="0F1B2A"/>
           <w:sz w:val="44"/>
@@ -22,7 +22,7 @@
       </w:pPr>
       <w:r>
         <w:rPr>
-          <w:rFonts w:ascii="Arial" w:hAnsi="Arial"/>
+          <w:rFonts w:ascii="Amazon Ember" w:hAnsi="Amazon Ember"/>
           <w:i/>
           <w:color w:val="0972D3"/>
           <w:sz w:val="26"/>
@@ -37,7 +37,7 @@
       </w:pPr>
       <w:r>
         <w:rPr>
-          <w:rFonts w:ascii="Arial" w:hAnsi="Arial"/>
+          <w:rFonts w:ascii="Amazon Ember" w:hAnsi="Amazon Ember"/>
           <w:b/>
           <w:color w:val="0F1B2A"/>
           <w:sz w:val="32"/>
@@ -51,7 +51,7 @@
       </w:pPr>
       <w:r>
         <w:rPr>
-          <w:rFonts w:ascii="Arial" w:hAnsi="Arial"/>
+          <w:rFonts w:ascii="Amazon Ember" w:hAnsi="Amazon Ember"/>
           <w:b/>
           <w:color w:val="0972D3"/>
           <w:sz w:val="28"/>
@@ -65,7 +65,7 @@
       </w:pPr>
       <w:r>
         <w:rPr>
-          <w:rFonts w:ascii="Arial" w:hAnsi="Arial"/>
+          <w:rFonts w:ascii="Amazon Ember" w:hAnsi="Amazon Ember"/>
           <w:color w:val="16191F"/>
           <w:sz w:val="21"/>
         </w:rPr>
@@ -78,7 +78,7 @@
       </w:pPr>
       <w:r>
         <w:rPr>
-          <w:rFonts w:ascii="Arial" w:hAnsi="Arial"/>
+          <w:rFonts w:ascii="Amazon Ember" w:hAnsi="Amazon Ember"/>
           <w:color w:val="16191F"/>
           <w:sz w:val="21"/>
         </w:rPr>
@@ -91,7 +91,7 @@
       </w:pPr>
       <w:r>
         <w:rPr>
-          <w:rFonts w:ascii="Arial" w:hAnsi="Arial"/>
+          <w:rFonts w:ascii="Amazon Ember" w:hAnsi="Amazon Ember"/>
           <w:color w:val="16191F"/>
           <w:sz w:val="21"/>
         </w:rPr>
@@ -104,7 +104,7 @@
       </w:pPr>
       <w:r>
         <w:rPr>
-          <w:rFonts w:ascii="Arial" w:hAnsi="Arial"/>
+          <w:rFonts w:ascii="Amazon Ember" w:hAnsi="Amazon Ember"/>
           <w:color w:val="16191F"/>
           <w:sz w:val="21"/>
         </w:rPr>
@@ -122,7 +122,7 @@
       </w:pPr>
       <w:r>
         <w:rPr>
-          <w:rFonts w:ascii="Arial" w:hAnsi="Arial"/>
+          <w:rFonts w:ascii="Amazon Ember" w:hAnsi="Amazon Ember"/>
           <w:b/>
           <w:color w:val="0972D3"/>
           <w:sz w:val="28"/>
@@ -136,7 +136,7 @@
       </w:pPr>
       <w:r>
         <w:rPr>
-          <w:rFonts w:ascii="Arial" w:hAnsi="Arial"/>
+          <w:rFonts w:ascii="Amazon Ember" w:hAnsi="Amazon Ember"/>
           <w:color w:val="16191F"/>
           <w:sz w:val="21"/>
         </w:rPr>
@@ -149,7 +149,7 @@
       </w:pPr>
       <w:r>
         <w:rPr>
-          <w:rFonts w:ascii="Arial" w:hAnsi="Arial"/>
+          <w:rFonts w:ascii="Amazon Ember" w:hAnsi="Amazon Ember"/>
           <w:color w:val="16191F"/>
           <w:sz w:val="21"/>
         </w:rPr>
@@ -162,7 +162,7 @@
       </w:pPr>
       <w:r>
         <w:rPr>
-          <w:rFonts w:ascii="Arial" w:hAnsi="Arial"/>
+          <w:rFonts w:ascii="Amazon Ember" w:hAnsi="Amazon Ember"/>
           <w:color w:val="16191F"/>
           <w:sz w:val="21"/>
         </w:rPr>
@@ -175,7 +175,7 @@
       </w:pPr>
       <w:r>
         <w:rPr>
-          <w:rFonts w:ascii="Arial" w:hAnsi="Arial"/>
+          <w:rFonts w:ascii="Amazon Ember" w:hAnsi="Amazon Ember"/>
           <w:color w:val="16191F"/>
           <w:sz w:val="21"/>
         </w:rPr>
@@ -188,7 +188,7 @@
       </w:pPr>
       <w:r>
         <w:rPr>
-          <w:rFonts w:ascii="Arial" w:hAnsi="Arial"/>
+          <w:rFonts w:ascii="Amazon Ember" w:hAnsi="Amazon Ember"/>
           <w:color w:val="16191F"/>
           <w:sz w:val="21"/>
         </w:rPr>
@@ -201,7 +201,7 @@
       </w:pPr>
       <w:r>
         <w:rPr>
-          <w:rFonts w:ascii="Arial" w:hAnsi="Arial"/>
+          <w:rFonts w:ascii="Amazon Ember" w:hAnsi="Amazon Ember"/>
           <w:color w:val="16191F"/>
           <w:sz w:val="21"/>
         </w:rPr>
@@ -214,7 +214,7 @@
       </w:pPr>
       <w:r>
         <w:rPr>
-          <w:rFonts w:ascii="Arial" w:hAnsi="Arial"/>
+          <w:rFonts w:ascii="Amazon Ember" w:hAnsi="Amazon Ember"/>
           <w:color w:val="16191F"/>
           <w:sz w:val="21"/>
         </w:rPr>
@@ -227,7 +227,7 @@
       </w:pPr>
       <w:r>
         <w:rPr>
-          <w:rFonts w:ascii="Arial" w:hAnsi="Arial"/>
+          <w:rFonts w:ascii="Amazon Ember" w:hAnsi="Amazon Ember"/>
           <w:color w:val="16191F"/>
           <w:sz w:val="21"/>
         </w:rPr>
@@ -240,7 +240,7 @@
       </w:pPr>
       <w:r>
         <w:rPr>
-          <w:rFonts w:ascii="Arial" w:hAnsi="Arial"/>
+          <w:rFonts w:ascii="Amazon Ember" w:hAnsi="Amazon Ember"/>
           <w:color w:val="16191F"/>
           <w:sz w:val="21"/>
         </w:rPr>
@@ -253,7 +253,7 @@
       </w:pPr>
       <w:r>
         <w:rPr>
-          <w:rFonts w:ascii="Arial" w:hAnsi="Arial"/>
+          <w:rFonts w:ascii="Amazon Ember" w:hAnsi="Amazon Ember"/>
           <w:color w:val="16191F"/>
           <w:sz w:val="21"/>
         </w:rPr>
@@ -266,7 +266,7 @@
       </w:pPr>
       <w:r>
         <w:rPr>
-          <w:rFonts w:ascii="Arial" w:hAnsi="Arial"/>
+          <w:rFonts w:ascii="Amazon Ember" w:hAnsi="Amazon Ember"/>
           <w:color w:val="16191F"/>
           <w:sz w:val="21"/>
         </w:rPr>
@@ -279,7 +279,7 @@
       </w:pPr>
       <w:r>
         <w:rPr>
-          <w:rFonts w:ascii="Arial" w:hAnsi="Arial"/>
+          <w:rFonts w:ascii="Amazon Ember" w:hAnsi="Amazon Ember"/>
           <w:color w:val="16191F"/>
           <w:sz w:val="21"/>
         </w:rPr>
@@ -292,7 +292,7 @@
       </w:pPr>
       <w:r>
         <w:rPr>
-          <w:rFonts w:ascii="Arial" w:hAnsi="Arial"/>
+          <w:rFonts w:ascii="Amazon Ember" w:hAnsi="Amazon Ember"/>
           <w:color w:val="16191F"/>
           <w:sz w:val="21"/>
         </w:rPr>
@@ -305,7 +305,7 @@
       </w:pPr>
       <w:r>
         <w:rPr>
-          <w:rFonts w:ascii="Arial" w:hAnsi="Arial"/>
+          <w:rFonts w:ascii="Amazon Ember" w:hAnsi="Amazon Ember"/>
           <w:color w:val="16191F"/>
           <w:sz w:val="21"/>
         </w:rPr>
@@ -318,7 +318,7 @@
       </w:pPr>
       <w:r>
         <w:rPr>
-          <w:rFonts w:ascii="Arial" w:hAnsi="Arial"/>
+          <w:rFonts w:ascii="Amazon Ember" w:hAnsi="Amazon Ember"/>
           <w:color w:val="16191F"/>
           <w:sz w:val="21"/>
         </w:rPr>
@@ -331,7 +331,7 @@
       </w:pPr>
       <w:r>
         <w:rPr>
-          <w:rFonts w:ascii="Arial" w:hAnsi="Arial"/>
+          <w:rFonts w:ascii="Amazon Ember" w:hAnsi="Amazon Ember"/>
           <w:color w:val="16191F"/>
           <w:sz w:val="21"/>
         </w:rPr>
@@ -344,7 +344,7 @@
       </w:pPr>
       <w:r>
         <w:rPr>
-          <w:rFonts w:ascii="Arial" w:hAnsi="Arial"/>
+          <w:rFonts w:ascii="Amazon Ember" w:hAnsi="Amazon Ember"/>
           <w:color w:val="16191F"/>
           <w:sz w:val="21"/>
         </w:rPr>
@@ -362,7 +362,7 @@
       </w:pPr>
       <w:r>
         <w:rPr>
-          <w:rFonts w:ascii="Arial" w:hAnsi="Arial"/>
+          <w:rFonts w:ascii="Amazon Ember" w:hAnsi="Amazon Ember"/>
           <w:b/>
           <w:color w:val="0972D3"/>
           <w:sz w:val="28"/>
@@ -376,7 +376,7 @@
       </w:pPr>
       <w:r>
         <w:rPr>
-          <w:rFonts w:ascii="Arial" w:hAnsi="Arial"/>
+          <w:rFonts w:ascii="Amazon Ember" w:hAnsi="Amazon Ember"/>
           <w:color w:val="16191F"/>
           <w:sz w:val="21"/>
         </w:rPr>
@@ -389,7 +389,7 @@
       </w:pPr>
       <w:r>
         <w:rPr>
-          <w:rFonts w:ascii="Arial" w:hAnsi="Arial"/>
+          <w:rFonts w:ascii="Amazon Ember" w:hAnsi="Amazon Ember"/>
           <w:color w:val="16191F"/>
           <w:sz w:val="21"/>
         </w:rPr>
@@ -402,7 +402,7 @@
       </w:pPr>
       <w:r>
         <w:rPr>
-          <w:rFonts w:ascii="Arial" w:hAnsi="Arial"/>
+          <w:rFonts w:ascii="Amazon Ember" w:hAnsi="Amazon Ember"/>
           <w:color w:val="16191F"/>
           <w:sz w:val="21"/>
         </w:rPr>
@@ -415,7 +415,7 @@
       </w:pPr>
       <w:r>
         <w:rPr>
-          <w:rFonts w:ascii="Arial" w:hAnsi="Arial"/>
+          <w:rFonts w:ascii="Amazon Ember" w:hAnsi="Amazon Ember"/>
           <w:color w:val="16191F"/>
           <w:sz w:val="21"/>
         </w:rPr>
@@ -428,7 +428,7 @@
       </w:pPr>
       <w:r>
         <w:rPr>
-          <w:rFonts w:ascii="Arial" w:hAnsi="Arial"/>
+          <w:rFonts w:ascii="Amazon Ember" w:hAnsi="Amazon Ember"/>
           <w:color w:val="16191F"/>
           <w:sz w:val="21"/>
         </w:rPr>
@@ -441,7 +441,7 @@
       </w:pPr>
       <w:r>
         <w:rPr>
-          <w:rFonts w:ascii="Arial" w:hAnsi="Arial"/>
+          <w:rFonts w:ascii="Amazon Ember" w:hAnsi="Amazon Ember"/>
           <w:color w:val="16191F"/>
           <w:sz w:val="21"/>
         </w:rPr>
@@ -454,7 +454,7 @@
       </w:pPr>
       <w:r>
         <w:rPr>
-          <w:rFonts w:ascii="Arial" w:hAnsi="Arial"/>
+          <w:rFonts w:ascii="Amazon Ember" w:hAnsi="Amazon Ember"/>
           <w:color w:val="16191F"/>
           <w:sz w:val="21"/>
         </w:rPr>
@@ -467,7 +467,7 @@
       </w:pPr>
       <w:r>
         <w:rPr>
-          <w:rFonts w:ascii="Arial" w:hAnsi="Arial"/>
+          <w:rFonts w:ascii="Amazon Ember" w:hAnsi="Amazon Ember"/>
           <w:color w:val="16191F"/>
           <w:sz w:val="21"/>
         </w:rPr>
@@ -485,7 +485,7 @@
       </w:pPr>
       <w:r>
         <w:rPr>
-          <w:rFonts w:ascii="Arial" w:hAnsi="Arial"/>
+          <w:rFonts w:ascii="Amazon Ember" w:hAnsi="Amazon Ember"/>
           <w:b/>
           <w:color w:val="0972D3"/>
           <w:sz w:val="28"/>
@@ -499,7 +499,7 @@
       </w:pPr>
       <w:r>
         <w:rPr>
-          <w:rFonts w:ascii="Arial" w:hAnsi="Arial"/>
+          <w:rFonts w:ascii="Amazon Ember" w:hAnsi="Amazon Ember"/>
           <w:b/>
           <w:color w:val="0F1B2A"/>
           <w:sz w:val="24"/>
@@ -513,7 +513,7 @@
       </w:pPr>
       <w:r>
         <w:rPr>
-          <w:rFonts w:ascii="Arial" w:hAnsi="Arial"/>
+          <w:rFonts w:ascii="Amazon Ember" w:hAnsi="Amazon Ember"/>
           <w:color w:val="16191F"/>
           <w:sz w:val="21"/>
         </w:rPr>
@@ -526,7 +526,7 @@
       </w:pPr>
       <w:r>
         <w:rPr>
-          <w:rFonts w:ascii="Arial" w:hAnsi="Arial"/>
+          <w:rFonts w:ascii="Amazon Ember" w:hAnsi="Amazon Ember"/>
           <w:color w:val="16191F"/>
           <w:sz w:val="21"/>
         </w:rPr>
@@ -539,7 +539,7 @@
       </w:pPr>
       <w:r>
         <w:rPr>
-          <w:rFonts w:ascii="Arial" w:hAnsi="Arial"/>
+          <w:rFonts w:ascii="Amazon Ember" w:hAnsi="Amazon Ember"/>
           <w:color w:val="16191F"/>
           <w:sz w:val="21"/>
         </w:rPr>
@@ -552,7 +552,7 @@
       </w:pPr>
       <w:r>
         <w:rPr>
-          <w:rFonts w:ascii="Arial" w:hAnsi="Arial"/>
+          <w:rFonts w:ascii="Amazon Ember" w:hAnsi="Amazon Ember"/>
           <w:color w:val="16191F"/>
           <w:sz w:val="21"/>
         </w:rPr>
@@ -565,7 +565,7 @@
       </w:pPr>
       <w:r>
         <w:rPr>
-          <w:rFonts w:ascii="Arial" w:hAnsi="Arial"/>
+          <w:rFonts w:ascii="Amazon Ember" w:hAnsi="Amazon Ember"/>
           <w:b/>
           <w:color w:val="0F1B2A"/>
           <w:sz w:val="24"/>
@@ -579,7 +579,7 @@
       </w:pPr>
       <w:r>
         <w:rPr>
-          <w:rFonts w:ascii="Arial" w:hAnsi="Arial"/>
+          <w:rFonts w:ascii="Amazon Ember" w:hAnsi="Amazon Ember"/>
           <w:color w:val="16191F"/>
           <w:sz w:val="21"/>
         </w:rPr>
@@ -592,7 +592,7 @@
       </w:pPr>
       <w:r>
         <w:rPr>
-          <w:rFonts w:ascii="Arial" w:hAnsi="Arial"/>
+          <w:rFonts w:ascii="Amazon Ember" w:hAnsi="Amazon Ember"/>
           <w:color w:val="16191F"/>
           <w:sz w:val="21"/>
         </w:rPr>
@@ -605,7 +605,7 @@
       </w:pPr>
       <w:r>
         <w:rPr>
-          <w:rFonts w:ascii="Arial" w:hAnsi="Arial"/>
+          <w:rFonts w:ascii="Amazon Ember" w:hAnsi="Amazon Ember"/>
           <w:color w:val="16191F"/>
           <w:sz w:val="21"/>
         </w:rPr>
@@ -618,7 +618,7 @@
       </w:pPr>
       <w:r>
         <w:rPr>
-          <w:rFonts w:ascii="Arial" w:hAnsi="Arial"/>
+          <w:rFonts w:ascii="Amazon Ember" w:hAnsi="Amazon Ember"/>
           <w:color w:val="16191F"/>
           <w:sz w:val="21"/>
         </w:rPr>
@@ -631,7 +631,7 @@
       </w:pPr>
       <w:r>
         <w:rPr>
-          <w:rFonts w:ascii="Arial" w:hAnsi="Arial"/>
+          <w:rFonts w:ascii="Amazon Ember" w:hAnsi="Amazon Ember"/>
           <w:color w:val="16191F"/>
           <w:sz w:val="21"/>
         </w:rPr>
@@ -644,7 +644,7 @@
       </w:pPr>
       <w:r>
         <w:rPr>
-          <w:rFonts w:ascii="Arial" w:hAnsi="Arial"/>
+          <w:rFonts w:ascii="Amazon Ember" w:hAnsi="Amazon Ember"/>
           <w:color w:val="16191F"/>
           <w:sz w:val="21"/>
         </w:rPr>
@@ -657,7 +657,7 @@
       </w:pPr>
       <w:r>
         <w:rPr>
-          <w:rFonts w:ascii="Arial" w:hAnsi="Arial"/>
+          <w:rFonts w:ascii="Amazon Ember" w:hAnsi="Amazon Ember"/>
           <w:color w:val="16191F"/>
           <w:sz w:val="21"/>
         </w:rPr>
@@ -670,7 +670,7 @@
       </w:pPr>
       <w:r>
         <w:rPr>
-          <w:rFonts w:ascii="Arial" w:hAnsi="Arial"/>
+          <w:rFonts w:ascii="Amazon Ember" w:hAnsi="Amazon Ember"/>
           <w:color w:val="16191F"/>
           <w:sz w:val="21"/>
         </w:rPr>
@@ -683,7 +683,7 @@
       </w:pPr>
       <w:r>
         <w:rPr>
-          <w:rFonts w:ascii="Arial" w:hAnsi="Arial"/>
+          <w:rFonts w:ascii="Amazon Ember" w:hAnsi="Amazon Ember"/>
           <w:color w:val="16191F"/>
           <w:sz w:val="21"/>
         </w:rPr>
@@ -701,7 +701,7 @@
       </w:pPr>
       <w:r>
         <w:rPr>
-          <w:rFonts w:ascii="Arial" w:hAnsi="Arial"/>
+          <w:rFonts w:ascii="Amazon Ember" w:hAnsi="Amazon Ember"/>
           <w:b/>
           <w:color w:val="0972D3"/>
           <w:sz w:val="28"/>
@@ -715,7 +715,7 @@
       </w:pPr>
       <w:r>
         <w:rPr>
-          <w:rFonts w:ascii="Arial" w:hAnsi="Arial"/>
+          <w:rFonts w:ascii="Amazon Ember" w:hAnsi="Amazon Ember"/>
           <w:color w:val="16191F"/>
           <w:sz w:val="21"/>
         </w:rPr>
@@ -744,7 +744,7 @@
             </w:pPr>
             <w:r>
               <w:rPr>
-                <w:rFonts w:ascii="Arial" w:hAnsi="Arial"/>
+                <w:rFonts w:ascii="Amazon Ember" w:hAnsi="Amazon Ember"/>
                 <w:b/>
                 <w:color w:val="FFFFFF"/>
                 <w:sz w:val="20"/>
@@ -764,7 +764,7 @@
             </w:pPr>
             <w:r>
               <w:rPr>
-                <w:rFonts w:ascii="Arial" w:hAnsi="Arial"/>
+                <w:rFonts w:ascii="Amazon Ember" w:hAnsi="Amazon Ember"/>
                 <w:b/>
                 <w:color w:val="FFFFFF"/>
                 <w:sz w:val="20"/>
@@ -783,7 +783,7 @@
           <w:p>
             <w:r>
               <w:rPr>
-                <w:rFonts w:ascii="Arial" w:hAnsi="Arial"/>
+                <w:rFonts w:ascii="Amazon Ember" w:hAnsi="Amazon Ember"/>
                 <w:color w:val="16191F"/>
                 <w:sz w:val="19"/>
               </w:rPr>
@@ -799,7 +799,7 @@
           <w:p>
             <w:r>
               <w:rPr>
-                <w:rFonts w:ascii="Arial" w:hAnsi="Arial"/>
+                <w:rFonts w:ascii="Amazon Ember" w:hAnsi="Amazon Ember"/>
                 <w:color w:val="16191F"/>
                 <w:sz w:val="19"/>
               </w:rPr>
@@ -817,7 +817,7 @@
           <w:p>
             <w:r>
               <w:rPr>
-                <w:rFonts w:ascii="Arial" w:hAnsi="Arial"/>
+                <w:rFonts w:ascii="Amazon Ember" w:hAnsi="Amazon Ember"/>
                 <w:color w:val="16191F"/>
                 <w:sz w:val="19"/>
               </w:rPr>
@@ -833,7 +833,7 @@
           <w:p>
             <w:r>
               <w:rPr>
-                <w:rFonts w:ascii="Arial" w:hAnsi="Arial"/>
+                <w:rFonts w:ascii="Amazon Ember" w:hAnsi="Amazon Ember"/>
                 <w:color w:val="16191F"/>
                 <w:sz w:val="19"/>
               </w:rPr>
@@ -851,7 +851,7 @@
           <w:p>
             <w:r>
               <w:rPr>
-                <w:rFonts w:ascii="Arial" w:hAnsi="Arial"/>
+                <w:rFonts w:ascii="Amazon Ember" w:hAnsi="Amazon Ember"/>
                 <w:color w:val="16191F"/>
                 <w:sz w:val="19"/>
               </w:rPr>
@@ -867,7 +867,7 @@
           <w:p>
             <w:r>
               <w:rPr>
-                <w:rFonts w:ascii="Arial" w:hAnsi="Arial"/>
+                <w:rFonts w:ascii="Amazon Ember" w:hAnsi="Amazon Ember"/>
                 <w:color w:val="16191F"/>
                 <w:sz w:val="19"/>
               </w:rPr>
@@ -885,7 +885,7 @@
           <w:p>
             <w:r>
               <w:rPr>
-                <w:rFonts w:ascii="Arial" w:hAnsi="Arial"/>
+                <w:rFonts w:ascii="Amazon Ember" w:hAnsi="Amazon Ember"/>
                 <w:color w:val="16191F"/>
                 <w:sz w:val="19"/>
               </w:rPr>
@@ -901,7 +901,7 @@
           <w:p>
             <w:r>
               <w:rPr>
-                <w:rFonts w:ascii="Arial" w:hAnsi="Arial"/>
+                <w:rFonts w:ascii="Amazon Ember" w:hAnsi="Amazon Ember"/>
                 <w:color w:val="16191F"/>
                 <w:sz w:val="19"/>
               </w:rPr>
@@ -923,7 +923,7 @@
       </w:pPr>
       <w:r>
         <w:rPr>
-          <w:rFonts w:ascii="Arial" w:hAnsi="Arial"/>
+          <w:rFonts w:ascii="Amazon Ember" w:hAnsi="Amazon Ember"/>
           <w:b/>
           <w:color w:val="0972D3"/>
           <w:sz w:val="28"/>
@@ -937,7 +937,7 @@
       </w:pPr>
       <w:r>
         <w:rPr>
-          <w:rFonts w:ascii="Arial" w:hAnsi="Arial"/>
+          <w:rFonts w:ascii="Amazon Ember" w:hAnsi="Amazon Ember"/>
           <w:b/>
           <w:color w:val="0F1B2A"/>
           <w:sz w:val="24"/>
@@ -951,7 +951,7 @@
       </w:pPr>
       <w:r>
         <w:rPr>
-          <w:rFonts w:ascii="Arial" w:hAnsi="Arial"/>
+          <w:rFonts w:ascii="Amazon Ember" w:hAnsi="Amazon Ember"/>
           <w:color w:val="16191F"/>
           <w:sz w:val="21"/>
         </w:rPr>
@@ -964,7 +964,7 @@
       </w:pPr>
       <w:r>
         <w:rPr>
-          <w:rFonts w:ascii="Arial" w:hAnsi="Arial"/>
+          <w:rFonts w:ascii="Amazon Ember" w:hAnsi="Amazon Ember"/>
           <w:color w:val="16191F"/>
           <w:sz w:val="21"/>
         </w:rPr>
@@ -977,7 +977,7 @@
       </w:pPr>
       <w:r>
         <w:rPr>
-          <w:rFonts w:ascii="Arial" w:hAnsi="Arial"/>
+          <w:rFonts w:ascii="Amazon Ember" w:hAnsi="Amazon Ember"/>
           <w:color w:val="16191F"/>
           <w:sz w:val="21"/>
         </w:rPr>
@@ -990,7 +990,7 @@
       </w:pPr>
       <w:r>
         <w:rPr>
-          <w:rFonts w:ascii="Arial" w:hAnsi="Arial"/>
+          <w:rFonts w:ascii="Amazon Ember" w:hAnsi="Amazon Ember"/>
           <w:color w:val="16191F"/>
           <w:sz w:val="21"/>
         </w:rPr>
@@ -1003,7 +1003,7 @@
       </w:pPr>
       <w:r>
         <w:rPr>
-          <w:rFonts w:ascii="Arial" w:hAnsi="Arial"/>
+          <w:rFonts w:ascii="Amazon Ember" w:hAnsi="Amazon Ember"/>
           <w:color w:val="16191F"/>
           <w:sz w:val="21"/>
         </w:rPr>
@@ -1016,7 +1016,7 @@
       </w:pPr>
       <w:r>
         <w:rPr>
-          <w:rFonts w:ascii="Arial" w:hAnsi="Arial"/>
+          <w:rFonts w:ascii="Amazon Ember" w:hAnsi="Amazon Ember"/>
           <w:color w:val="16191F"/>
           <w:sz w:val="21"/>
         </w:rPr>
@@ -1029,7 +1029,7 @@
       </w:pPr>
       <w:r>
         <w:rPr>
-          <w:rFonts w:ascii="Arial" w:hAnsi="Arial"/>
+          <w:rFonts w:ascii="Amazon Ember" w:hAnsi="Amazon Ember"/>
           <w:color w:val="16191F"/>
           <w:sz w:val="21"/>
         </w:rPr>
@@ -1042,7 +1042,7 @@
       </w:pPr>
       <w:r>
         <w:rPr>
-          <w:rFonts w:ascii="Arial" w:hAnsi="Arial"/>
+          <w:rFonts w:ascii="Amazon Ember" w:hAnsi="Amazon Ember"/>
           <w:color w:val="16191F"/>
           <w:sz w:val="21"/>
         </w:rPr>
@@ -1055,7 +1055,7 @@
       </w:pPr>
       <w:r>
         <w:rPr>
-          <w:rFonts w:ascii="Arial" w:hAnsi="Arial"/>
+          <w:rFonts w:ascii="Amazon Ember" w:hAnsi="Amazon Ember"/>
           <w:color w:val="16191F"/>
           <w:sz w:val="21"/>
         </w:rPr>
@@ -1068,7 +1068,7 @@
       </w:pPr>
       <w:r>
         <w:rPr>
-          <w:rFonts w:ascii="Consolas" w:hAnsi="Consolas"/>
+          <w:rFonts w:ascii="Amazon Ember Mono" w:hAnsi="Amazon Ember Mono"/>
           <w:color w:val="16191F"/>
           <w:sz w:val="18"/>
         </w:rPr>
@@ -1111,7 +1111,7 @@
       </w:pPr>
       <w:r>
         <w:rPr>
-          <w:rFonts w:ascii="Arial" w:hAnsi="Arial"/>
+          <w:rFonts w:ascii="Amazon Ember" w:hAnsi="Amazon Ember"/>
           <w:color w:val="16191F"/>
           <w:sz w:val="21"/>
         </w:rPr>
@@ -1129,7 +1129,7 @@
       </w:pPr>
       <w:r>
         <w:rPr>
-          <w:rFonts w:ascii="Arial" w:hAnsi="Arial"/>
+          <w:rFonts w:ascii="Amazon Ember" w:hAnsi="Amazon Ember"/>
           <w:b/>
           <w:color w:val="0F1B2A"/>
           <w:sz w:val="24"/>
@@ -1143,7 +1143,7 @@
       </w:pPr>
       <w:r>
         <w:rPr>
-          <w:rFonts w:ascii="Arial" w:hAnsi="Arial"/>
+          <w:rFonts w:ascii="Amazon Ember" w:hAnsi="Amazon Ember"/>
           <w:color w:val="16191F"/>
           <w:sz w:val="21"/>
         </w:rPr>
@@ -1156,7 +1156,7 @@
       </w:pPr>
       <w:r>
         <w:rPr>
-          <w:rFonts w:ascii="Arial" w:hAnsi="Arial"/>
+          <w:rFonts w:ascii="Amazon Ember" w:hAnsi="Amazon Ember"/>
           <w:color w:val="16191F"/>
           <w:sz w:val="21"/>
         </w:rPr>
@@ -1169,7 +1169,7 @@
       </w:pPr>
       <w:r>
         <w:rPr>
-          <w:rFonts w:ascii="Arial" w:hAnsi="Arial"/>
+          <w:rFonts w:ascii="Amazon Ember" w:hAnsi="Amazon Ember"/>
           <w:color w:val="16191F"/>
           <w:sz w:val="21"/>
         </w:rPr>
@@ -1182,7 +1182,7 @@
       </w:pPr>
       <w:r>
         <w:rPr>
-          <w:rFonts w:ascii="Consolas" w:hAnsi="Consolas"/>
+          <w:rFonts w:ascii="Amazon Ember Mono" w:hAnsi="Amazon Ember Mono"/>
           <w:color w:val="16191F"/>
           <w:sz w:val="18"/>
         </w:rPr>
@@ -1209,7 +1209,7 @@
       </w:pPr>
       <w:r>
         <w:rPr>
-          <w:rFonts w:ascii="Arial" w:hAnsi="Arial"/>
+          <w:rFonts w:ascii="Amazon Ember" w:hAnsi="Amazon Ember"/>
           <w:color w:val="16191F"/>
           <w:sz w:val="21"/>
         </w:rPr>
@@ -1222,7 +1222,7 @@
       </w:pPr>
       <w:r>
         <w:rPr>
-          <w:rFonts w:ascii="Arial" w:hAnsi="Arial"/>
+          <w:rFonts w:ascii="Amazon Ember" w:hAnsi="Amazon Ember"/>
           <w:color w:val="16191F"/>
           <w:sz w:val="21"/>
         </w:rPr>
@@ -1235,7 +1235,7 @@
       </w:pPr>
       <w:r>
         <w:rPr>
-          <w:rFonts w:ascii="Arial" w:hAnsi="Arial"/>
+          <w:rFonts w:ascii="Amazon Ember" w:hAnsi="Amazon Ember"/>
           <w:color w:val="16191F"/>
           <w:sz w:val="21"/>
         </w:rPr>
@@ -1248,7 +1248,7 @@
       </w:pPr>
       <w:r>
         <w:rPr>
-          <w:rFonts w:ascii="Arial" w:hAnsi="Arial"/>
+          <w:rFonts w:ascii="Amazon Ember" w:hAnsi="Amazon Ember"/>
           <w:color w:val="16191F"/>
           <w:sz w:val="21"/>
         </w:rPr>
@@ -1261,7 +1261,7 @@
       </w:pPr>
       <w:r>
         <w:rPr>
-          <w:rFonts w:ascii="Arial" w:hAnsi="Arial"/>
+          <w:rFonts w:ascii="Amazon Ember" w:hAnsi="Amazon Ember"/>
           <w:color w:val="16191F"/>
           <w:sz w:val="21"/>
         </w:rPr>
@@ -1274,7 +1274,7 @@
       </w:pPr>
       <w:r>
         <w:rPr>
-          <w:rFonts w:ascii="Arial" w:hAnsi="Arial"/>
+          <w:rFonts w:ascii="Amazon Ember" w:hAnsi="Amazon Ember"/>
           <w:color w:val="16191F"/>
           <w:sz w:val="21"/>
         </w:rPr>
@@ -1287,7 +1287,7 @@
       </w:pPr>
       <w:r>
         <w:rPr>
-          <w:rFonts w:ascii="Arial" w:hAnsi="Arial"/>
+          <w:rFonts w:ascii="Amazon Ember" w:hAnsi="Amazon Ember"/>
           <w:color w:val="16191F"/>
           <w:sz w:val="21"/>
         </w:rPr>
@@ -1300,7 +1300,7 @@
       </w:pPr>
       <w:r>
         <w:rPr>
-          <w:rFonts w:ascii="Arial" w:hAnsi="Arial"/>
+          <w:rFonts w:ascii="Amazon Ember" w:hAnsi="Amazon Ember"/>
           <w:color w:val="16191F"/>
           <w:sz w:val="21"/>
         </w:rPr>
@@ -1313,7 +1313,7 @@
       </w:pPr>
       <w:r>
         <w:rPr>
-          <w:rFonts w:ascii="Arial" w:hAnsi="Arial"/>
+          <w:rFonts w:ascii="Amazon Ember" w:hAnsi="Amazon Ember"/>
           <w:color w:val="16191F"/>
           <w:sz w:val="21"/>
         </w:rPr>
@@ -1326,7 +1326,7 @@
       </w:pPr>
       <w:r>
         <w:rPr>
-          <w:rFonts w:ascii="Arial" w:hAnsi="Arial"/>
+          <w:rFonts w:ascii="Amazon Ember" w:hAnsi="Amazon Ember"/>
           <w:color w:val="16191F"/>
           <w:sz w:val="21"/>
         </w:rPr>
@@ -1339,7 +1339,7 @@
       </w:pPr>
       <w:r>
         <w:rPr>
-          <w:rFonts w:ascii="Arial" w:hAnsi="Arial"/>
+          <w:rFonts w:ascii="Amazon Ember" w:hAnsi="Amazon Ember"/>
           <w:color w:val="16191F"/>
           <w:sz w:val="21"/>
         </w:rPr>
@@ -1352,7 +1352,7 @@
       </w:pPr>
       <w:r>
         <w:rPr>
-          <w:rFonts w:ascii="Consolas" w:hAnsi="Consolas"/>
+          <w:rFonts w:ascii="Amazon Ember Mono" w:hAnsi="Amazon Ember Mono"/>
           <w:color w:val="16191F"/>
           <w:sz w:val="18"/>
         </w:rPr>
@@ -1384,7 +1384,7 @@
       </w:pPr>
       <w:r>
         <w:rPr>
-          <w:rFonts w:ascii="Arial" w:hAnsi="Arial"/>
+          <w:rFonts w:ascii="Amazon Ember" w:hAnsi="Amazon Ember"/>
           <w:b/>
           <w:color w:val="0F1B2A"/>
           <w:sz w:val="24"/>
@@ -1398,7 +1398,7 @@
       </w:pPr>
       <w:r>
         <w:rPr>
-          <w:rFonts w:ascii="Arial" w:hAnsi="Arial"/>
+          <w:rFonts w:ascii="Amazon Ember" w:hAnsi="Amazon Ember"/>
           <w:color w:val="16191F"/>
           <w:sz w:val="21"/>
         </w:rPr>
@@ -1411,7 +1411,7 @@
       </w:pPr>
       <w:r>
         <w:rPr>
-          <w:rFonts w:ascii="Arial" w:hAnsi="Arial"/>
+          <w:rFonts w:ascii="Amazon Ember" w:hAnsi="Amazon Ember"/>
           <w:color w:val="16191F"/>
           <w:sz w:val="21"/>
         </w:rPr>
@@ -1424,7 +1424,7 @@
       </w:pPr>
       <w:r>
         <w:rPr>
-          <w:rFonts w:ascii="Arial" w:hAnsi="Arial"/>
+          <w:rFonts w:ascii="Amazon Ember" w:hAnsi="Amazon Ember"/>
           <w:color w:val="16191F"/>
           <w:sz w:val="21"/>
         </w:rPr>
@@ -1437,7 +1437,7 @@
       </w:pPr>
       <w:r>
         <w:rPr>
-          <w:rFonts w:ascii="Arial" w:hAnsi="Arial"/>
+          <w:rFonts w:ascii="Amazon Ember" w:hAnsi="Amazon Ember"/>
           <w:color w:val="16191F"/>
           <w:sz w:val="21"/>
         </w:rPr>
@@ -1450,7 +1450,7 @@
       </w:pPr>
       <w:r>
         <w:rPr>
-          <w:rFonts w:ascii="Arial" w:hAnsi="Arial"/>
+          <w:rFonts w:ascii="Amazon Ember" w:hAnsi="Amazon Ember"/>
           <w:color w:val="16191F"/>
           <w:sz w:val="21"/>
         </w:rPr>
@@ -1463,7 +1463,7 @@
       </w:pPr>
       <w:r>
         <w:rPr>
-          <w:rFonts w:ascii="Arial" w:hAnsi="Arial"/>
+          <w:rFonts w:ascii="Amazon Ember" w:hAnsi="Amazon Ember"/>
           <w:color w:val="16191F"/>
           <w:sz w:val="21"/>
         </w:rPr>
@@ -1476,7 +1476,7 @@
       </w:pPr>
       <w:r>
         <w:rPr>
-          <w:rFonts w:ascii="Arial" w:hAnsi="Arial"/>
+          <w:rFonts w:ascii="Amazon Ember" w:hAnsi="Amazon Ember"/>
           <w:color w:val="16191F"/>
           <w:sz w:val="21"/>
         </w:rPr>
@@ -1489,7 +1489,7 @@
       </w:pPr>
       <w:r>
         <w:rPr>
-          <w:rFonts w:ascii="Arial" w:hAnsi="Arial"/>
+          <w:rFonts w:ascii="Amazon Ember" w:hAnsi="Amazon Ember"/>
           <w:color w:val="16191F"/>
           <w:sz w:val="21"/>
         </w:rPr>
@@ -1502,7 +1502,7 @@
       </w:pPr>
       <w:r>
         <w:rPr>
-          <w:rFonts w:ascii="Arial" w:hAnsi="Arial"/>
+          <w:rFonts w:ascii="Amazon Ember" w:hAnsi="Amazon Ember"/>
           <w:color w:val="16191F"/>
           <w:sz w:val="21"/>
         </w:rPr>
@@ -1515,7 +1515,7 @@
       </w:pPr>
       <w:r>
         <w:rPr>
-          <w:rFonts w:ascii="Arial" w:hAnsi="Arial"/>
+          <w:rFonts w:ascii="Amazon Ember" w:hAnsi="Amazon Ember"/>
           <w:color w:val="16191F"/>
           <w:sz w:val="21"/>
         </w:rPr>
@@ -1528,7 +1528,7 @@
       </w:pPr>
       <w:r>
         <w:rPr>
-          <w:rFonts w:ascii="Arial" w:hAnsi="Arial"/>
+          <w:rFonts w:ascii="Amazon Ember" w:hAnsi="Amazon Ember"/>
           <w:color w:val="16191F"/>
           <w:sz w:val="21"/>
         </w:rPr>
@@ -1541,7 +1541,7 @@
       </w:pPr>
       <w:r>
         <w:rPr>
-          <w:rFonts w:ascii="Arial" w:hAnsi="Arial"/>
+          <w:rFonts w:ascii="Amazon Ember" w:hAnsi="Amazon Ember"/>
           <w:color w:val="16191F"/>
           <w:sz w:val="21"/>
         </w:rPr>
@@ -1554,7 +1554,7 @@
       </w:pPr>
       <w:r>
         <w:rPr>
-          <w:rFonts w:ascii="Arial" w:hAnsi="Arial"/>
+          <w:rFonts w:ascii="Amazon Ember" w:hAnsi="Amazon Ember"/>
           <w:color w:val="16191F"/>
           <w:sz w:val="21"/>
         </w:rPr>
@@ -1567,7 +1567,7 @@
       </w:pPr>
       <w:r>
         <w:rPr>
-          <w:rFonts w:ascii="Arial" w:hAnsi="Arial"/>
+          <w:rFonts w:ascii="Amazon Ember" w:hAnsi="Amazon Ember"/>
           <w:color w:val="16191F"/>
           <w:sz w:val="21"/>
         </w:rPr>
@@ -1580,7 +1580,7 @@
       </w:pPr>
       <w:r>
         <w:rPr>
-          <w:rFonts w:ascii="Arial" w:hAnsi="Arial"/>
+          <w:rFonts w:ascii="Amazon Ember" w:hAnsi="Amazon Ember"/>
           <w:color w:val="16191F"/>
           <w:sz w:val="21"/>
         </w:rPr>
@@ -1593,7 +1593,7 @@
       </w:pPr>
       <w:r>
         <w:rPr>
-          <w:rFonts w:ascii="Arial" w:hAnsi="Arial"/>
+          <w:rFonts w:ascii="Amazon Ember" w:hAnsi="Amazon Ember"/>
           <w:color w:val="16191F"/>
           <w:sz w:val="21"/>
         </w:rPr>
@@ -1606,7 +1606,7 @@
       </w:pPr>
       <w:r>
         <w:rPr>
-          <w:rFonts w:ascii="Arial" w:hAnsi="Arial"/>
+          <w:rFonts w:ascii="Amazon Ember" w:hAnsi="Amazon Ember"/>
           <w:color w:val="16191F"/>
           <w:sz w:val="21"/>
         </w:rPr>
@@ -1619,7 +1619,7 @@
       </w:pPr>
       <w:r>
         <w:rPr>
-          <w:rFonts w:ascii="Arial" w:hAnsi="Arial"/>
+          <w:rFonts w:ascii="Amazon Ember" w:hAnsi="Amazon Ember"/>
           <w:color w:val="16191F"/>
           <w:sz w:val="21"/>
         </w:rPr>
@@ -1632,7 +1632,7 @@
       </w:pPr>
       <w:r>
         <w:rPr>
-          <w:rFonts w:ascii="Arial" w:hAnsi="Arial"/>
+          <w:rFonts w:ascii="Amazon Ember" w:hAnsi="Amazon Ember"/>
           <w:color w:val="16191F"/>
           <w:sz w:val="21"/>
         </w:rPr>
@@ -1645,7 +1645,7 @@
       </w:pPr>
       <w:r>
         <w:rPr>
-          <w:rFonts w:ascii="Arial" w:hAnsi="Arial"/>
+          <w:rFonts w:ascii="Amazon Ember" w:hAnsi="Amazon Ember"/>
           <w:color w:val="16191F"/>
           <w:sz w:val="21"/>
         </w:rPr>
@@ -1658,7 +1658,7 @@
       </w:pPr>
       <w:r>
         <w:rPr>
-          <w:rFonts w:ascii="Arial" w:hAnsi="Arial"/>
+          <w:rFonts w:ascii="Amazon Ember" w:hAnsi="Amazon Ember"/>
           <w:color w:val="16191F"/>
           <w:sz w:val="21"/>
         </w:rPr>
@@ -1671,7 +1671,7 @@
       </w:pPr>
       <w:r>
         <w:rPr>
-          <w:rFonts w:ascii="Arial" w:hAnsi="Arial"/>
+          <w:rFonts w:ascii="Amazon Ember" w:hAnsi="Amazon Ember"/>
           <w:color w:val="16191F"/>
           <w:sz w:val="21"/>
         </w:rPr>
@@ -1684,7 +1684,7 @@
       </w:pPr>
       <w:r>
         <w:rPr>
-          <w:rFonts w:ascii="Arial" w:hAnsi="Arial"/>
+          <w:rFonts w:ascii="Amazon Ember" w:hAnsi="Amazon Ember"/>
           <w:color w:val="16191F"/>
           <w:sz w:val="21"/>
         </w:rPr>
@@ -1697,7 +1697,7 @@
       </w:pPr>
       <w:r>
         <w:rPr>
-          <w:rFonts w:ascii="Arial" w:hAnsi="Arial"/>
+          <w:rFonts w:ascii="Amazon Ember" w:hAnsi="Amazon Ember"/>
           <w:color w:val="16191F"/>
           <w:sz w:val="21"/>
         </w:rPr>
@@ -1715,7 +1715,7 @@
       </w:pPr>
       <w:r>
         <w:rPr>
-          <w:rFonts w:ascii="Arial" w:hAnsi="Arial"/>
+          <w:rFonts w:ascii="Amazon Ember" w:hAnsi="Amazon Ember"/>
           <w:b/>
           <w:color w:val="0F1B2A"/>
           <w:sz w:val="24"/>
@@ -1729,7 +1729,7 @@
       </w:pPr>
       <w:r>
         <w:rPr>
-          <w:rFonts w:ascii="Arial" w:hAnsi="Arial"/>
+          <w:rFonts w:ascii="Amazon Ember" w:hAnsi="Amazon Ember"/>
           <w:color w:val="16191F"/>
           <w:sz w:val="21"/>
         </w:rPr>
@@ -1742,7 +1742,7 @@
       </w:pPr>
       <w:r>
         <w:rPr>
-          <w:rFonts w:ascii="Arial" w:hAnsi="Arial"/>
+          <w:rFonts w:ascii="Amazon Ember" w:hAnsi="Amazon Ember"/>
           <w:color w:val="16191F"/>
           <w:sz w:val="21"/>
         </w:rPr>
@@ -1755,7 +1755,7 @@
       </w:pPr>
       <w:r>
         <w:rPr>
-          <w:rFonts w:ascii="Arial" w:hAnsi="Arial"/>
+          <w:rFonts w:ascii="Amazon Ember" w:hAnsi="Amazon Ember"/>
           <w:color w:val="16191F"/>
           <w:sz w:val="21"/>
         </w:rPr>
@@ -1768,7 +1768,7 @@
       </w:pPr>
       <w:r>
         <w:rPr>
-          <w:rFonts w:ascii="Arial" w:hAnsi="Arial"/>
+          <w:rFonts w:ascii="Amazon Ember" w:hAnsi="Amazon Ember"/>
           <w:color w:val="16191F"/>
           <w:sz w:val="21"/>
         </w:rPr>
@@ -1781,7 +1781,7 @@
       </w:pPr>
       <w:r>
         <w:rPr>
-          <w:rFonts w:ascii="Arial" w:hAnsi="Arial"/>
+          <w:rFonts w:ascii="Amazon Ember" w:hAnsi="Amazon Ember"/>
           <w:color w:val="16191F"/>
           <w:sz w:val="21"/>
         </w:rPr>
@@ -1794,7 +1794,7 @@
       </w:pPr>
       <w:r>
         <w:rPr>
-          <w:rFonts w:ascii="Arial" w:hAnsi="Arial"/>
+          <w:rFonts w:ascii="Amazon Ember" w:hAnsi="Amazon Ember"/>
           <w:color w:val="16191F"/>
           <w:sz w:val="21"/>
         </w:rPr>
@@ -1807,7 +1807,7 @@
       </w:pPr>
       <w:r>
         <w:rPr>
-          <w:rFonts w:ascii="Arial" w:hAnsi="Arial"/>
+          <w:rFonts w:ascii="Amazon Ember" w:hAnsi="Amazon Ember"/>
           <w:color w:val="16191F"/>
           <w:sz w:val="21"/>
         </w:rPr>
@@ -1820,7 +1820,7 @@
       </w:pPr>
       <w:r>
         <w:rPr>
-          <w:rFonts w:ascii="Arial" w:hAnsi="Arial"/>
+          <w:rFonts w:ascii="Amazon Ember" w:hAnsi="Amazon Ember"/>
           <w:color w:val="16191F"/>
           <w:sz w:val="21"/>
         </w:rPr>
@@ -1833,7 +1833,7 @@
       </w:pPr>
       <w:r>
         <w:rPr>
-          <w:rFonts w:ascii="Arial" w:hAnsi="Arial"/>
+          <w:rFonts w:ascii="Amazon Ember" w:hAnsi="Amazon Ember"/>
           <w:color w:val="16191F"/>
           <w:sz w:val="21"/>
         </w:rPr>
@@ -1846,7 +1846,7 @@
       </w:pPr>
       <w:r>
         <w:rPr>
-          <w:rFonts w:ascii="Arial" w:hAnsi="Arial"/>
+          <w:rFonts w:ascii="Amazon Ember" w:hAnsi="Amazon Ember"/>
           <w:color w:val="16191F"/>
           <w:sz w:val="21"/>
         </w:rPr>
@@ -1859,7 +1859,7 @@
       </w:pPr>
       <w:r>
         <w:rPr>
-          <w:rFonts w:ascii="Arial" w:hAnsi="Arial"/>
+          <w:rFonts w:ascii="Amazon Ember" w:hAnsi="Amazon Ember"/>
           <w:color w:val="16191F"/>
           <w:sz w:val="21"/>
         </w:rPr>
@@ -1872,7 +1872,7 @@
       </w:pPr>
       <w:r>
         <w:rPr>
-          <w:rFonts w:ascii="Arial" w:hAnsi="Arial"/>
+          <w:rFonts w:ascii="Amazon Ember" w:hAnsi="Amazon Ember"/>
           <w:color w:val="16191F"/>
           <w:sz w:val="21"/>
         </w:rPr>
@@ -1885,7 +1885,7 @@
       </w:pPr>
       <w:r>
         <w:rPr>
-          <w:rFonts w:ascii="Arial" w:hAnsi="Arial"/>
+          <w:rFonts w:ascii="Amazon Ember" w:hAnsi="Amazon Ember"/>
           <w:color w:val="16191F"/>
           <w:sz w:val="21"/>
         </w:rPr>
@@ -1898,7 +1898,7 @@
       </w:pPr>
       <w:r>
         <w:rPr>
-          <w:rFonts w:ascii="Arial" w:hAnsi="Arial"/>
+          <w:rFonts w:ascii="Amazon Ember" w:hAnsi="Amazon Ember"/>
           <w:color w:val="16191F"/>
           <w:sz w:val="21"/>
         </w:rPr>
@@ -1911,7 +1911,7 @@
       </w:pPr>
       <w:r>
         <w:rPr>
-          <w:rFonts w:ascii="Arial" w:hAnsi="Arial"/>
+          <w:rFonts w:ascii="Amazon Ember" w:hAnsi="Amazon Ember"/>
           <w:color w:val="16191F"/>
           <w:sz w:val="21"/>
         </w:rPr>
@@ -1924,7 +1924,7 @@
       </w:pPr>
       <w:r>
         <w:rPr>
-          <w:rFonts w:ascii="Arial" w:hAnsi="Arial"/>
+          <w:rFonts w:ascii="Amazon Ember" w:hAnsi="Amazon Ember"/>
           <w:color w:val="16191F"/>
           <w:sz w:val="21"/>
         </w:rPr>
@@ -1937,7 +1937,7 @@
       </w:pPr>
       <w:r>
         <w:rPr>
-          <w:rFonts w:ascii="Arial" w:hAnsi="Arial"/>
+          <w:rFonts w:ascii="Amazon Ember" w:hAnsi="Amazon Ember"/>
           <w:color w:val="16191F"/>
           <w:sz w:val="21"/>
         </w:rPr>
@@ -1950,7 +1950,7 @@
       </w:pPr>
       <w:r>
         <w:rPr>
-          <w:rFonts w:ascii="Arial" w:hAnsi="Arial"/>
+          <w:rFonts w:ascii="Amazon Ember" w:hAnsi="Amazon Ember"/>
           <w:color w:val="16191F"/>
           <w:sz w:val="21"/>
         </w:rPr>
@@ -1963,7 +1963,7 @@
       </w:pPr>
       <w:r>
         <w:rPr>
-          <w:rFonts w:ascii="Arial" w:hAnsi="Arial"/>
+          <w:rFonts w:ascii="Amazon Ember" w:hAnsi="Amazon Ember"/>
           <w:color w:val="16191F"/>
           <w:sz w:val="21"/>
         </w:rPr>
@@ -1976,7 +1976,7 @@
       </w:pPr>
       <w:r>
         <w:rPr>
-          <w:rFonts w:ascii="Arial" w:hAnsi="Arial"/>
+          <w:rFonts w:ascii="Amazon Ember" w:hAnsi="Amazon Ember"/>
           <w:color w:val="16191F"/>
           <w:sz w:val="21"/>
         </w:rPr>
@@ -1989,7 +1989,7 @@
       </w:pPr>
       <w:r>
         <w:rPr>
-          <w:rFonts w:ascii="Arial" w:hAnsi="Arial"/>
+          <w:rFonts w:ascii="Amazon Ember" w:hAnsi="Amazon Ember"/>
           <w:color w:val="16191F"/>
           <w:sz w:val="21"/>
         </w:rPr>
@@ -2002,7 +2002,7 @@
       </w:pPr>
       <w:r>
         <w:rPr>
-          <w:rFonts w:ascii="Arial" w:hAnsi="Arial"/>
+          <w:rFonts w:ascii="Amazon Ember" w:hAnsi="Amazon Ember"/>
           <w:color w:val="16191F"/>
           <w:sz w:val="21"/>
         </w:rPr>
@@ -2015,7 +2015,7 @@
       </w:pPr>
       <w:r>
         <w:rPr>
-          <w:rFonts w:ascii="Arial" w:hAnsi="Arial"/>
+          <w:rFonts w:ascii="Amazon Ember" w:hAnsi="Amazon Ember"/>
           <w:color w:val="16191F"/>
           <w:sz w:val="21"/>
         </w:rPr>
@@ -2028,7 +2028,7 @@
       </w:pPr>
       <w:r>
         <w:rPr>
-          <w:rFonts w:ascii="Arial" w:hAnsi="Arial"/>
+          <w:rFonts w:ascii="Amazon Ember" w:hAnsi="Amazon Ember"/>
           <w:color w:val="16191F"/>
           <w:sz w:val="21"/>
         </w:rPr>
@@ -2041,7 +2041,7 @@
       </w:pPr>
       <w:r>
         <w:rPr>
-          <w:rFonts w:ascii="Arial" w:hAnsi="Arial"/>
+          <w:rFonts w:ascii="Amazon Ember" w:hAnsi="Amazon Ember"/>
           <w:color w:val="16191F"/>
           <w:sz w:val="21"/>
         </w:rPr>
@@ -2054,7 +2054,7 @@
       </w:pPr>
       <w:r>
         <w:rPr>
-          <w:rFonts w:ascii="Arial" w:hAnsi="Arial"/>
+          <w:rFonts w:ascii="Amazon Ember" w:hAnsi="Amazon Ember"/>
           <w:color w:val="16191F"/>
           <w:sz w:val="21"/>
         </w:rPr>
@@ -2067,7 +2067,7 @@
       </w:pPr>
       <w:r>
         <w:rPr>
-          <w:rFonts w:ascii="Arial" w:hAnsi="Arial"/>
+          <w:rFonts w:ascii="Amazon Ember" w:hAnsi="Amazon Ember"/>
           <w:color w:val="16191F"/>
           <w:sz w:val="21"/>
         </w:rPr>
@@ -2080,7 +2080,7 @@
       </w:pPr>
       <w:r>
         <w:rPr>
-          <w:rFonts w:ascii="Arial" w:hAnsi="Arial"/>
+          <w:rFonts w:ascii="Amazon Ember" w:hAnsi="Amazon Ember"/>
           <w:color w:val="16191F"/>
           <w:sz w:val="21"/>
         </w:rPr>
@@ -2093,7 +2093,7 @@
       </w:pPr>
       <w:r>
         <w:rPr>
-          <w:rFonts w:ascii="Arial" w:hAnsi="Arial"/>
+          <w:rFonts w:ascii="Amazon Ember" w:hAnsi="Amazon Ember"/>
           <w:color w:val="16191F"/>
           <w:sz w:val="21"/>
         </w:rPr>
@@ -2106,7 +2106,7 @@
       </w:pPr>
       <w:r>
         <w:rPr>
-          <w:rFonts w:ascii="Arial" w:hAnsi="Arial"/>
+          <w:rFonts w:ascii="Amazon Ember" w:hAnsi="Amazon Ember"/>
           <w:color w:val="16191F"/>
           <w:sz w:val="21"/>
         </w:rPr>
@@ -2119,7 +2119,7 @@
       </w:pPr>
       <w:r>
         <w:rPr>
-          <w:rFonts w:ascii="Arial" w:hAnsi="Arial"/>
+          <w:rFonts w:ascii="Amazon Ember" w:hAnsi="Amazon Ember"/>
           <w:color w:val="16191F"/>
           <w:sz w:val="21"/>
         </w:rPr>
@@ -2132,7 +2132,7 @@
       </w:pPr>
       <w:r>
         <w:rPr>
-          <w:rFonts w:ascii="Arial" w:hAnsi="Arial"/>
+          <w:rFonts w:ascii="Amazon Ember" w:hAnsi="Amazon Ember"/>
           <w:color w:val="16191F"/>
           <w:sz w:val="21"/>
         </w:rPr>
@@ -2150,7 +2150,7 @@
       </w:pPr>
       <w:r>
         <w:rPr>
-          <w:rFonts w:ascii="Arial" w:hAnsi="Arial"/>
+          <w:rFonts w:ascii="Amazon Ember" w:hAnsi="Amazon Ember"/>
           <w:b/>
           <w:color w:val="0F1B2A"/>
           <w:sz w:val="24"/>
@@ -2164,7 +2164,7 @@
       </w:pPr>
       <w:r>
         <w:rPr>
-          <w:rFonts w:ascii="Arial" w:hAnsi="Arial"/>
+          <w:rFonts w:ascii="Amazon Ember" w:hAnsi="Amazon Ember"/>
           <w:color w:val="16191F"/>
           <w:sz w:val="21"/>
         </w:rPr>
@@ -2177,7 +2177,7 @@
       </w:pPr>
       <w:r>
         <w:rPr>
-          <w:rFonts w:ascii="Arial" w:hAnsi="Arial"/>
+          <w:rFonts w:ascii="Amazon Ember" w:hAnsi="Amazon Ember"/>
           <w:color w:val="16191F"/>
           <w:sz w:val="21"/>
         </w:rPr>
@@ -2190,7 +2190,7 @@
       </w:pPr>
       <w:r>
         <w:rPr>
-          <w:rFonts w:ascii="Arial" w:hAnsi="Arial"/>
+          <w:rFonts w:ascii="Amazon Ember" w:hAnsi="Amazon Ember"/>
           <w:color w:val="16191F"/>
           <w:sz w:val="21"/>
         </w:rPr>
@@ -2203,7 +2203,7 @@
       </w:pPr>
       <w:r>
         <w:rPr>
-          <w:rFonts w:ascii="Arial" w:hAnsi="Arial"/>
+          <w:rFonts w:ascii="Amazon Ember" w:hAnsi="Amazon Ember"/>
           <w:color w:val="16191F"/>
           <w:sz w:val="21"/>
         </w:rPr>
@@ -2216,7 +2216,7 @@
       </w:pPr>
       <w:r>
         <w:rPr>
-          <w:rFonts w:ascii="Arial" w:hAnsi="Arial"/>
+          <w:rFonts w:ascii="Amazon Ember" w:hAnsi="Amazon Ember"/>
           <w:color w:val="16191F"/>
           <w:sz w:val="21"/>
         </w:rPr>
@@ -2229,7 +2229,7 @@
       </w:pPr>
       <w:r>
         <w:rPr>
-          <w:rFonts w:ascii="Arial" w:hAnsi="Arial"/>
+          <w:rFonts w:ascii="Amazon Ember" w:hAnsi="Amazon Ember"/>
           <w:color w:val="16191F"/>
           <w:sz w:val="21"/>
         </w:rPr>
@@ -2242,7 +2242,7 @@
       </w:pPr>
       <w:r>
         <w:rPr>
-          <w:rFonts w:ascii="Arial" w:hAnsi="Arial"/>
+          <w:rFonts w:ascii="Amazon Ember" w:hAnsi="Amazon Ember"/>
           <w:color w:val="16191F"/>
           <w:sz w:val="21"/>
         </w:rPr>
@@ -2255,7 +2255,7 @@
       </w:pPr>
       <w:r>
         <w:rPr>
-          <w:rFonts w:ascii="Arial" w:hAnsi="Arial"/>
+          <w:rFonts w:ascii="Amazon Ember" w:hAnsi="Amazon Ember"/>
           <w:color w:val="16191F"/>
           <w:sz w:val="21"/>
         </w:rPr>
@@ -2268,7 +2268,7 @@
       </w:pPr>
       <w:r>
         <w:rPr>
-          <w:rFonts w:ascii="Arial" w:hAnsi="Arial"/>
+          <w:rFonts w:ascii="Amazon Ember" w:hAnsi="Amazon Ember"/>
           <w:color w:val="16191F"/>
           <w:sz w:val="21"/>
         </w:rPr>
@@ -2281,7 +2281,7 @@
       </w:pPr>
       <w:r>
         <w:rPr>
-          <w:rFonts w:ascii="Arial" w:hAnsi="Arial"/>
+          <w:rFonts w:ascii="Amazon Ember" w:hAnsi="Amazon Ember"/>
           <w:color w:val="16191F"/>
           <w:sz w:val="21"/>
         </w:rPr>
@@ -2294,7 +2294,7 @@
       </w:pPr>
       <w:r>
         <w:rPr>
-          <w:rFonts w:ascii="Arial" w:hAnsi="Arial"/>
+          <w:rFonts w:ascii="Amazon Ember" w:hAnsi="Amazon Ember"/>
           <w:color w:val="16191F"/>
           <w:sz w:val="21"/>
         </w:rPr>
@@ -2307,7 +2307,7 @@
       </w:pPr>
       <w:r>
         <w:rPr>
-          <w:rFonts w:ascii="Arial" w:hAnsi="Arial"/>
+          <w:rFonts w:ascii="Amazon Ember" w:hAnsi="Amazon Ember"/>
           <w:color w:val="16191F"/>
           <w:sz w:val="21"/>
         </w:rPr>
@@ -2320,7 +2320,7 @@
       </w:pPr>
       <w:r>
         <w:rPr>
-          <w:rFonts w:ascii="Arial" w:hAnsi="Arial"/>
+          <w:rFonts w:ascii="Amazon Ember" w:hAnsi="Amazon Ember"/>
           <w:color w:val="16191F"/>
           <w:sz w:val="21"/>
         </w:rPr>
@@ -2333,7 +2333,7 @@
       </w:pPr>
       <w:r>
         <w:rPr>
-          <w:rFonts w:ascii="Arial" w:hAnsi="Arial"/>
+          <w:rFonts w:ascii="Amazon Ember" w:hAnsi="Amazon Ember"/>
           <w:color w:val="16191F"/>
           <w:sz w:val="21"/>
         </w:rPr>
@@ -2346,7 +2346,7 @@
       </w:pPr>
       <w:r>
         <w:rPr>
-          <w:rFonts w:ascii="Arial" w:hAnsi="Arial"/>
+          <w:rFonts w:ascii="Amazon Ember" w:hAnsi="Amazon Ember"/>
           <w:color w:val="16191F"/>
           <w:sz w:val="21"/>
         </w:rPr>
@@ -2359,7 +2359,7 @@
       </w:pPr>
       <w:r>
         <w:rPr>
-          <w:rFonts w:ascii="Arial" w:hAnsi="Arial"/>
+          <w:rFonts w:ascii="Amazon Ember" w:hAnsi="Amazon Ember"/>
           <w:color w:val="16191F"/>
           <w:sz w:val="21"/>
         </w:rPr>
@@ -2372,7 +2372,7 @@
       </w:pPr>
       <w:r>
         <w:rPr>
-          <w:rFonts w:ascii="Arial" w:hAnsi="Arial"/>
+          <w:rFonts w:ascii="Amazon Ember" w:hAnsi="Amazon Ember"/>
           <w:color w:val="16191F"/>
           <w:sz w:val="21"/>
         </w:rPr>
@@ -2385,7 +2385,7 @@
       </w:pPr>
       <w:r>
         <w:rPr>
-          <w:rFonts w:ascii="Arial" w:hAnsi="Arial"/>
+          <w:rFonts w:ascii="Amazon Ember" w:hAnsi="Amazon Ember"/>
           <w:color w:val="16191F"/>
           <w:sz w:val="21"/>
         </w:rPr>
@@ -2398,7 +2398,7 @@
       </w:pPr>
       <w:r>
         <w:rPr>
-          <w:rFonts w:ascii="Arial" w:hAnsi="Arial"/>
+          <w:rFonts w:ascii="Amazon Ember" w:hAnsi="Amazon Ember"/>
           <w:color w:val="16191F"/>
           <w:sz w:val="21"/>
         </w:rPr>
@@ -2411,7 +2411,7 @@
       </w:pPr>
       <w:r>
         <w:rPr>
-          <w:rFonts w:ascii="Arial" w:hAnsi="Arial"/>
+          <w:rFonts w:ascii="Amazon Ember" w:hAnsi="Amazon Ember"/>
           <w:color w:val="16191F"/>
           <w:sz w:val="21"/>
         </w:rPr>
@@ -2424,7 +2424,7 @@
       </w:pPr>
       <w:r>
         <w:rPr>
-          <w:rFonts w:ascii="Arial" w:hAnsi="Arial"/>
+          <w:rFonts w:ascii="Amazon Ember" w:hAnsi="Amazon Ember"/>
           <w:color w:val="16191F"/>
           <w:sz w:val="21"/>
         </w:rPr>
@@ -2437,7 +2437,7 @@
       </w:pPr>
       <w:r>
         <w:rPr>
-          <w:rFonts w:ascii="Arial" w:hAnsi="Arial"/>
+          <w:rFonts w:ascii="Amazon Ember" w:hAnsi="Amazon Ember"/>
           <w:color w:val="16191F"/>
           <w:sz w:val="21"/>
         </w:rPr>
@@ -2450,7 +2450,7 @@
       </w:pPr>
       <w:r>
         <w:rPr>
-          <w:rFonts w:ascii="Arial" w:hAnsi="Arial"/>
+          <w:rFonts w:ascii="Amazon Ember" w:hAnsi="Amazon Ember"/>
           <w:color w:val="16191F"/>
           <w:sz w:val="21"/>
         </w:rPr>
@@ -2463,7 +2463,7 @@
       </w:pPr>
       <w:r>
         <w:rPr>
-          <w:rFonts w:ascii="Arial" w:hAnsi="Arial"/>
+          <w:rFonts w:ascii="Amazon Ember" w:hAnsi="Amazon Ember"/>
           <w:color w:val="16191F"/>
           <w:sz w:val="21"/>
         </w:rPr>
@@ -2476,7 +2476,7 @@
       </w:pPr>
       <w:r>
         <w:rPr>
-          <w:rFonts w:ascii="Arial" w:hAnsi="Arial"/>
+          <w:rFonts w:ascii="Amazon Ember" w:hAnsi="Amazon Ember"/>
           <w:color w:val="16191F"/>
           <w:sz w:val="21"/>
         </w:rPr>
@@ -2489,7 +2489,7 @@
       </w:pPr>
       <w:r>
         <w:rPr>
-          <w:rFonts w:ascii="Arial" w:hAnsi="Arial"/>
+          <w:rFonts w:ascii="Amazon Ember" w:hAnsi="Amazon Ember"/>
           <w:color w:val="16191F"/>
           <w:sz w:val="21"/>
         </w:rPr>
@@ -2502,7 +2502,7 @@
       </w:pPr>
       <w:r>
         <w:rPr>
-          <w:rFonts w:ascii="Arial" w:hAnsi="Arial"/>
+          <w:rFonts w:ascii="Amazon Ember" w:hAnsi="Amazon Ember"/>
           <w:color w:val="16191F"/>
           <w:sz w:val="21"/>
         </w:rPr>
@@ -2515,7 +2515,7 @@
       </w:pPr>
       <w:r>
         <w:rPr>
-          <w:rFonts w:ascii="Arial" w:hAnsi="Arial"/>
+          <w:rFonts w:ascii="Amazon Ember" w:hAnsi="Amazon Ember"/>
           <w:color w:val="16191F"/>
           <w:sz w:val="21"/>
         </w:rPr>
@@ -2528,7 +2528,7 @@
       </w:pPr>
       <w:r>
         <w:rPr>
-          <w:rFonts w:ascii="Arial" w:hAnsi="Arial"/>
+          <w:rFonts w:ascii="Amazon Ember" w:hAnsi="Amazon Ember"/>
           <w:color w:val="16191F"/>
           <w:sz w:val="21"/>
         </w:rPr>
@@ -2546,7 +2546,7 @@
       </w:pPr>
       <w:r>
         <w:rPr>
-          <w:rFonts w:ascii="Arial" w:hAnsi="Arial"/>
+          <w:rFonts w:ascii="Amazon Ember" w:hAnsi="Amazon Ember"/>
           <w:b/>
           <w:color w:val="0972D3"/>
           <w:sz w:val="28"/>
@@ -2560,7 +2560,7 @@
       </w:pPr>
       <w:r>
         <w:rPr>
-          <w:rFonts w:ascii="Arial" w:hAnsi="Arial"/>
+          <w:rFonts w:ascii="Amazon Ember" w:hAnsi="Amazon Ember"/>
           <w:color w:val="16191F"/>
           <w:sz w:val="21"/>
         </w:rPr>
@@ -2573,7 +2573,7 @@
       </w:pPr>
       <w:r>
         <w:rPr>
-          <w:rFonts w:ascii="Arial" w:hAnsi="Arial"/>
+          <w:rFonts w:ascii="Amazon Ember" w:hAnsi="Amazon Ember"/>
           <w:b/>
           <w:color w:val="0F1B2A"/>
           <w:sz w:val="24"/>
@@ -2587,7 +2587,7 @@
       </w:pPr>
       <w:r>
         <w:rPr>
-          <w:rFonts w:ascii="Arial" w:hAnsi="Arial"/>
+          <w:rFonts w:ascii="Amazon Ember" w:hAnsi="Amazon Ember"/>
           <w:color w:val="16191F"/>
           <w:sz w:val="21"/>
         </w:rPr>
@@ -2600,7 +2600,7 @@
       </w:pPr>
       <w:r>
         <w:rPr>
-          <w:rFonts w:ascii="Arial" w:hAnsi="Arial"/>
+          <w:rFonts w:ascii="Amazon Ember" w:hAnsi="Amazon Ember"/>
           <w:color w:val="16191F"/>
           <w:sz w:val="21"/>
         </w:rPr>
@@ -2613,7 +2613,7 @@
       </w:pPr>
       <w:r>
         <w:rPr>
-          <w:rFonts w:ascii="Arial" w:hAnsi="Arial"/>
+          <w:rFonts w:ascii="Amazon Ember" w:hAnsi="Amazon Ember"/>
           <w:color w:val="16191F"/>
           <w:sz w:val="21"/>
         </w:rPr>
@@ -2626,7 +2626,7 @@
       </w:pPr>
       <w:r>
         <w:rPr>
-          <w:rFonts w:ascii="Arial" w:hAnsi="Arial"/>
+          <w:rFonts w:ascii="Amazon Ember" w:hAnsi="Amazon Ember"/>
           <w:b/>
           <w:color w:val="0F1B2A"/>
           <w:sz w:val="24"/>
@@ -2640,7 +2640,7 @@
       </w:pPr>
       <w:r>
         <w:rPr>
-          <w:rFonts w:ascii="Arial" w:hAnsi="Arial"/>
+          <w:rFonts w:ascii="Amazon Ember" w:hAnsi="Amazon Ember"/>
           <w:color w:val="16191F"/>
           <w:sz w:val="21"/>
         </w:rPr>
@@ -2653,7 +2653,7 @@
       </w:pPr>
       <w:r>
         <w:rPr>
-          <w:rFonts w:ascii="Arial" w:hAnsi="Arial"/>
+          <w:rFonts w:ascii="Amazon Ember" w:hAnsi="Amazon Ember"/>
           <w:color w:val="16191F"/>
           <w:sz w:val="21"/>
         </w:rPr>
@@ -2666,7 +2666,7 @@
       </w:pPr>
       <w:r>
         <w:rPr>
-          <w:rFonts w:ascii="Arial" w:hAnsi="Arial"/>
+          <w:rFonts w:ascii="Amazon Ember" w:hAnsi="Amazon Ember"/>
           <w:color w:val="16191F"/>
           <w:sz w:val="21"/>
         </w:rPr>
@@ -2679,7 +2679,7 @@
       </w:pPr>
       <w:r>
         <w:rPr>
-          <w:rFonts w:ascii="Arial" w:hAnsi="Arial"/>
+          <w:rFonts w:ascii="Amazon Ember" w:hAnsi="Amazon Ember"/>
           <w:color w:val="16191F"/>
           <w:sz w:val="21"/>
         </w:rPr>
@@ -2697,7 +2697,7 @@
       </w:pPr>
       <w:r>
         <w:rPr>
-          <w:rFonts w:ascii="Arial" w:hAnsi="Arial"/>
+          <w:rFonts w:ascii="Amazon Ember" w:hAnsi="Amazon Ember"/>
           <w:b/>
           <w:color w:val="0972D3"/>
           <w:sz w:val="28"/>
@@ -2711,7 +2711,7 @@
       </w:pPr>
       <w:r>
         <w:rPr>
-          <w:rFonts w:ascii="Arial" w:hAnsi="Arial"/>
+          <w:rFonts w:ascii="Amazon Ember" w:hAnsi="Amazon Ember"/>
           <w:color w:val="16191F"/>
           <w:sz w:val="21"/>
         </w:rPr>
@@ -2742,7 +2742,7 @@
             </w:pPr>
             <w:r>
               <w:rPr>
-                <w:rFonts w:ascii="Arial" w:hAnsi="Arial"/>
+                <w:rFonts w:ascii="Amazon Ember" w:hAnsi="Amazon Ember"/>
                 <w:b/>
                 <w:color w:val="FFFFFF"/>
                 <w:sz w:val="20"/>
@@ -2762,7 +2762,7 @@
             </w:pPr>
             <w:r>
               <w:rPr>
-                <w:rFonts w:ascii="Arial" w:hAnsi="Arial"/>
+                <w:rFonts w:ascii="Amazon Ember" w:hAnsi="Amazon Ember"/>
                 <w:b/>
                 <w:color w:val="FFFFFF"/>
                 <w:sz w:val="20"/>
@@ -2782,7 +2782,7 @@
             </w:pPr>
             <w:r>
               <w:rPr>
-                <w:rFonts w:ascii="Arial" w:hAnsi="Arial"/>
+                <w:rFonts w:ascii="Amazon Ember" w:hAnsi="Amazon Ember"/>
                 <w:b/>
                 <w:color w:val="FFFFFF"/>
                 <w:sz w:val="20"/>
@@ -2802,7 +2802,7 @@
             </w:pPr>
             <w:r>
               <w:rPr>
-                <w:rFonts w:ascii="Arial" w:hAnsi="Arial"/>
+                <w:rFonts w:ascii="Amazon Ember" w:hAnsi="Amazon Ember"/>
                 <w:b/>
                 <w:color w:val="FFFFFF"/>
                 <w:sz w:val="20"/>
@@ -2821,7 +2821,7 @@
           <w:p>
             <w:r>
               <w:rPr>
-                <w:rFonts w:ascii="Arial" w:hAnsi="Arial"/>
+                <w:rFonts w:ascii="Amazon Ember" w:hAnsi="Amazon Ember"/>
                 <w:color w:val="16191F"/>
                 <w:sz w:val="19"/>
               </w:rPr>
@@ -2837,7 +2837,7 @@
           <w:p>
             <w:r>
               <w:rPr>
-                <w:rFonts w:ascii="Arial" w:hAnsi="Arial"/>
+                <w:rFonts w:ascii="Amazon Ember" w:hAnsi="Amazon Ember"/>
                 <w:color w:val="16191F"/>
                 <w:sz w:val="19"/>
               </w:rPr>
@@ -2853,7 +2853,7 @@
           <w:p>
             <w:r>
               <w:rPr>
-                <w:rFonts w:ascii="Arial" w:hAnsi="Arial"/>
+                <w:rFonts w:ascii="Amazon Ember" w:hAnsi="Amazon Ember"/>
                 <w:color w:val="16191F"/>
                 <w:sz w:val="19"/>
               </w:rPr>
@@ -2869,7 +2869,7 @@
           <w:p>
             <w:r>
               <w:rPr>
-                <w:rFonts w:ascii="Arial" w:hAnsi="Arial"/>
+                <w:rFonts w:ascii="Amazon Ember" w:hAnsi="Amazon Ember"/>
                 <w:color w:val="16191F"/>
                 <w:sz w:val="19"/>
               </w:rPr>
@@ -2887,7 +2887,7 @@
           <w:p>
             <w:r>
               <w:rPr>
-                <w:rFonts w:ascii="Arial" w:hAnsi="Arial"/>
+                <w:rFonts w:ascii="Amazon Ember" w:hAnsi="Amazon Ember"/>
                 <w:color w:val="16191F"/>
                 <w:sz w:val="19"/>
               </w:rPr>
@@ -2903,7 +2903,7 @@
           <w:p>
             <w:r>
               <w:rPr>
-                <w:rFonts w:ascii="Arial" w:hAnsi="Arial"/>
+                <w:rFonts w:ascii="Amazon Ember" w:hAnsi="Amazon Ember"/>
                 <w:color w:val="16191F"/>
                 <w:sz w:val="19"/>
               </w:rPr>
@@ -2919,7 +2919,7 @@
           <w:p>
             <w:r>
               <w:rPr>
-                <w:rFonts w:ascii="Arial" w:hAnsi="Arial"/>
+                <w:rFonts w:ascii="Amazon Ember" w:hAnsi="Amazon Ember"/>
                 <w:color w:val="16191F"/>
                 <w:sz w:val="19"/>
               </w:rPr>
@@ -2935,7 +2935,7 @@
           <w:p>
             <w:r>
               <w:rPr>
-                <w:rFonts w:ascii="Arial" w:hAnsi="Arial"/>
+                <w:rFonts w:ascii="Amazon Ember" w:hAnsi="Amazon Ember"/>
                 <w:color w:val="16191F"/>
                 <w:sz w:val="19"/>
               </w:rPr>
@@ -2953,7 +2953,7 @@
           <w:p>
             <w:r>
               <w:rPr>
-                <w:rFonts w:ascii="Arial" w:hAnsi="Arial"/>
+                <w:rFonts w:ascii="Amazon Ember" w:hAnsi="Amazon Ember"/>
                 <w:color w:val="16191F"/>
                 <w:sz w:val="19"/>
               </w:rPr>
@@ -2969,7 +2969,7 @@
           <w:p>
             <w:r>
               <w:rPr>
-                <w:rFonts w:ascii="Arial" w:hAnsi="Arial"/>
+                <w:rFonts w:ascii="Amazon Ember" w:hAnsi="Amazon Ember"/>
                 <w:color w:val="16191F"/>
                 <w:sz w:val="19"/>
               </w:rPr>
@@ -2985,7 +2985,7 @@
           <w:p>
             <w:r>
               <w:rPr>
-                <w:rFonts w:ascii="Arial" w:hAnsi="Arial"/>
+                <w:rFonts w:ascii="Amazon Ember" w:hAnsi="Amazon Ember"/>
                 <w:color w:val="16191F"/>
                 <w:sz w:val="19"/>
               </w:rPr>
@@ -3001,7 +3001,7 @@
           <w:p>
             <w:r>
               <w:rPr>
-                <w:rFonts w:ascii="Arial" w:hAnsi="Arial"/>
+                <w:rFonts w:ascii="Amazon Ember" w:hAnsi="Amazon Ember"/>
                 <w:color w:val="16191F"/>
                 <w:sz w:val="19"/>
               </w:rPr>
@@ -3019,7 +3019,7 @@
           <w:p>
             <w:r>
               <w:rPr>
-                <w:rFonts w:ascii="Arial" w:hAnsi="Arial"/>
+                <w:rFonts w:ascii="Amazon Ember" w:hAnsi="Amazon Ember"/>
                 <w:color w:val="16191F"/>
                 <w:sz w:val="19"/>
               </w:rPr>
@@ -3035,7 +3035,7 @@
           <w:p>
             <w:r>
               <w:rPr>
-                <w:rFonts w:ascii="Arial" w:hAnsi="Arial"/>
+                <w:rFonts w:ascii="Amazon Ember" w:hAnsi="Amazon Ember"/>
                 <w:color w:val="16191F"/>
                 <w:sz w:val="19"/>
               </w:rPr>
@@ -3051,7 +3051,7 @@
           <w:p>
             <w:r>
               <w:rPr>
-                <w:rFonts w:ascii="Arial" w:hAnsi="Arial"/>
+                <w:rFonts w:ascii="Amazon Ember" w:hAnsi="Amazon Ember"/>
                 <w:color w:val="16191F"/>
                 <w:sz w:val="19"/>
               </w:rPr>
@@ -3067,7 +3067,7 @@
           <w:p>
             <w:r>
               <w:rPr>
-                <w:rFonts w:ascii="Arial" w:hAnsi="Arial"/>
+                <w:rFonts w:ascii="Amazon Ember" w:hAnsi="Amazon Ember"/>
                 <w:color w:val="16191F"/>
                 <w:sz w:val="19"/>
               </w:rPr>
@@ -3085,7 +3085,7 @@
           <w:p>
             <w:r>
               <w:rPr>
-                <w:rFonts w:ascii="Arial" w:hAnsi="Arial"/>
+                <w:rFonts w:ascii="Amazon Ember" w:hAnsi="Amazon Ember"/>
                 <w:color w:val="16191F"/>
                 <w:sz w:val="19"/>
               </w:rPr>
@@ -3101,7 +3101,7 @@
           <w:p>
             <w:r>
               <w:rPr>
-                <w:rFonts w:ascii="Arial" w:hAnsi="Arial"/>
+                <w:rFonts w:ascii="Amazon Ember" w:hAnsi="Amazon Ember"/>
                 <w:color w:val="16191F"/>
                 <w:sz w:val="19"/>
               </w:rPr>
@@ -3117,7 +3117,7 @@
           <w:p>
             <w:r>
               <w:rPr>
-                <w:rFonts w:ascii="Arial" w:hAnsi="Arial"/>
+                <w:rFonts w:ascii="Amazon Ember" w:hAnsi="Amazon Ember"/>
                 <w:color w:val="16191F"/>
                 <w:sz w:val="19"/>
               </w:rPr>
@@ -3133,7 +3133,7 @@
           <w:p>
             <w:r>
               <w:rPr>
-                <w:rFonts w:ascii="Arial" w:hAnsi="Arial"/>
+                <w:rFonts w:ascii="Amazon Ember" w:hAnsi="Amazon Ember"/>
                 <w:color w:val="16191F"/>
                 <w:sz w:val="19"/>
               </w:rPr>
@@ -3155,7 +3155,7 @@
       </w:pPr>
       <w:r>
         <w:rPr>
-          <w:rFonts w:ascii="Arial" w:hAnsi="Arial"/>
+          <w:rFonts w:ascii="Amazon Ember" w:hAnsi="Amazon Ember"/>
           <w:b/>
           <w:color w:val="0972D3"/>
           <w:sz w:val="28"/>
@@ -3169,7 +3169,7 @@
       </w:pPr>
       <w:r>
         <w:rPr>
-          <w:rFonts w:ascii="Arial" w:hAnsi="Arial"/>
+          <w:rFonts w:ascii="Amazon Ember" w:hAnsi="Amazon Ember"/>
           <w:color w:val="16191F"/>
           <w:sz w:val="21"/>
         </w:rPr>
@@ -3182,7 +3182,7 @@
       </w:pPr>
       <w:r>
         <w:rPr>
-          <w:rFonts w:ascii="Arial" w:hAnsi="Arial"/>
+          <w:rFonts w:ascii="Amazon Ember" w:hAnsi="Amazon Ember"/>
           <w:b/>
           <w:color w:val="0F1B2A"/>
           <w:sz w:val="24"/>
@@ -3196,7 +3196,7 @@
       </w:pPr>
       <w:r>
         <w:rPr>
-          <w:rFonts w:ascii="Arial" w:hAnsi="Arial"/>
+          <w:rFonts w:ascii="Amazon Ember" w:hAnsi="Amazon Ember"/>
           <w:color w:val="16191F"/>
           <w:sz w:val="21"/>
         </w:rPr>
@@ -3209,7 +3209,7 @@
       </w:pPr>
       <w:r>
         <w:rPr>
-          <w:rFonts w:ascii="Arial" w:hAnsi="Arial"/>
+          <w:rFonts w:ascii="Amazon Ember" w:hAnsi="Amazon Ember"/>
           <w:color w:val="16191F"/>
           <w:sz w:val="21"/>
         </w:rPr>
@@ -3222,7 +3222,7 @@
       </w:pPr>
       <w:r>
         <w:rPr>
-          <w:rFonts w:ascii="Arial" w:hAnsi="Arial"/>
+          <w:rFonts w:ascii="Amazon Ember" w:hAnsi="Amazon Ember"/>
           <w:color w:val="16191F"/>
           <w:sz w:val="21"/>
         </w:rPr>
@@ -3235,7 +3235,7 @@
       </w:pPr>
       <w:r>
         <w:rPr>
-          <w:rFonts w:ascii="Arial" w:hAnsi="Arial"/>
+          <w:rFonts w:ascii="Amazon Ember" w:hAnsi="Amazon Ember"/>
           <w:b/>
           <w:color w:val="0F1B2A"/>
           <w:sz w:val="24"/>
@@ -3269,7 +3269,7 @@
             </w:pPr>
             <w:r>
               <w:rPr>
-                <w:rFonts w:ascii="Arial" w:hAnsi="Arial"/>
+                <w:rFonts w:ascii="Amazon Ember" w:hAnsi="Amazon Ember"/>
                 <w:b/>
                 <w:color w:val="FFFFFF"/>
                 <w:sz w:val="20"/>
@@ -3289,7 +3289,7 @@
             </w:pPr>
             <w:r>
               <w:rPr>
-                <w:rFonts w:ascii="Arial" w:hAnsi="Arial"/>
+                <w:rFonts w:ascii="Amazon Ember" w:hAnsi="Amazon Ember"/>
                 <w:b/>
                 <w:color w:val="FFFFFF"/>
                 <w:sz w:val="20"/>
@@ -3309,7 +3309,7 @@
             </w:pPr>
             <w:r>
               <w:rPr>
-                <w:rFonts w:ascii="Arial" w:hAnsi="Arial"/>
+                <w:rFonts w:ascii="Amazon Ember" w:hAnsi="Amazon Ember"/>
                 <w:b/>
                 <w:color w:val="FFFFFF"/>
                 <w:sz w:val="20"/>
@@ -3329,7 +3329,7 @@
             </w:pPr>
             <w:r>
               <w:rPr>
-                <w:rFonts w:ascii="Arial" w:hAnsi="Arial"/>
+                <w:rFonts w:ascii="Amazon Ember" w:hAnsi="Amazon Ember"/>
                 <w:b/>
                 <w:color w:val="FFFFFF"/>
                 <w:sz w:val="20"/>
@@ -3349,7 +3349,7 @@
             </w:pPr>
             <w:r>
               <w:rPr>
-                <w:rFonts w:ascii="Arial" w:hAnsi="Arial"/>
+                <w:rFonts w:ascii="Amazon Ember" w:hAnsi="Amazon Ember"/>
                 <w:b/>
                 <w:color w:val="FFFFFF"/>
                 <w:sz w:val="20"/>
@@ -3369,7 +3369,7 @@
             </w:pPr>
             <w:r>
               <w:rPr>
-                <w:rFonts w:ascii="Arial" w:hAnsi="Arial"/>
+                <w:rFonts w:ascii="Amazon Ember" w:hAnsi="Amazon Ember"/>
                 <w:b/>
                 <w:color w:val="FFFFFF"/>
                 <w:sz w:val="20"/>
@@ -3388,7 +3388,7 @@
           <w:p>
             <w:r>
               <w:rPr>
-                <w:rFonts w:ascii="Arial" w:hAnsi="Arial"/>
+                <w:rFonts w:ascii="Amazon Ember" w:hAnsi="Amazon Ember"/>
                 <w:color w:val="16191F"/>
                 <w:sz w:val="19"/>
               </w:rPr>
@@ -3404,7 +3404,7 @@
           <w:p>
             <w:r>
               <w:rPr>
-                <w:rFonts w:ascii="Arial" w:hAnsi="Arial"/>
+                <w:rFonts w:ascii="Amazon Ember" w:hAnsi="Amazon Ember"/>
                 <w:color w:val="16191F"/>
                 <w:sz w:val="19"/>
               </w:rPr>
@@ -3420,7 +3420,7 @@
           <w:p>
             <w:r>
               <w:rPr>
-                <w:rFonts w:ascii="Arial" w:hAnsi="Arial"/>
+                <w:rFonts w:ascii="Amazon Ember" w:hAnsi="Amazon Ember"/>
                 <w:color w:val="16191F"/>
                 <w:sz w:val="19"/>
               </w:rPr>
@@ -3436,7 +3436,7 @@
           <w:p>
             <w:r>
               <w:rPr>
-                <w:rFonts w:ascii="Arial" w:hAnsi="Arial"/>
+                <w:rFonts w:ascii="Amazon Ember" w:hAnsi="Amazon Ember"/>
                 <w:color w:val="16191F"/>
                 <w:sz w:val="19"/>
               </w:rPr>
@@ -3452,7 +3452,7 @@
           <w:p>
             <w:r>
               <w:rPr>
-                <w:rFonts w:ascii="Arial" w:hAnsi="Arial"/>
+                <w:rFonts w:ascii="Amazon Ember" w:hAnsi="Amazon Ember"/>
                 <w:color w:val="16191F"/>
                 <w:sz w:val="19"/>
               </w:rPr>
@@ -3468,7 +3468,7 @@
           <w:p>
             <w:r>
               <w:rPr>
-                <w:rFonts w:ascii="Arial" w:hAnsi="Arial"/>
+                <w:rFonts w:ascii="Amazon Ember" w:hAnsi="Amazon Ember"/>
                 <w:color w:val="16191F"/>
                 <w:sz w:val="19"/>
               </w:rPr>
@@ -3486,7 +3486,7 @@
           <w:p>
             <w:r>
               <w:rPr>
-                <w:rFonts w:ascii="Arial" w:hAnsi="Arial"/>
+                <w:rFonts w:ascii="Amazon Ember" w:hAnsi="Amazon Ember"/>
                 <w:color w:val="16191F"/>
                 <w:sz w:val="19"/>
               </w:rPr>
@@ -3502,7 +3502,7 @@
           <w:p>
             <w:r>
               <w:rPr>
-                <w:rFonts w:ascii="Arial" w:hAnsi="Arial"/>
+                <w:rFonts w:ascii="Amazon Ember" w:hAnsi="Amazon Ember"/>
                 <w:color w:val="16191F"/>
                 <w:sz w:val="19"/>
               </w:rPr>
@@ -3518,7 +3518,7 @@
           <w:p>
             <w:r>
               <w:rPr>
-                <w:rFonts w:ascii="Arial" w:hAnsi="Arial"/>
+                <w:rFonts w:ascii="Amazon Ember" w:hAnsi="Amazon Ember"/>
                 <w:color w:val="16191F"/>
                 <w:sz w:val="19"/>
               </w:rPr>
@@ -3534,7 +3534,7 @@
           <w:p>
             <w:r>
               <w:rPr>
-                <w:rFonts w:ascii="Arial" w:hAnsi="Arial"/>
+                <w:rFonts w:ascii="Amazon Ember" w:hAnsi="Amazon Ember"/>
                 <w:color w:val="16191F"/>
                 <w:sz w:val="19"/>
               </w:rPr>
@@ -3550,7 +3550,7 @@
           <w:p>
             <w:r>
               <w:rPr>
-                <w:rFonts w:ascii="Arial" w:hAnsi="Arial"/>
+                <w:rFonts w:ascii="Amazon Ember" w:hAnsi="Amazon Ember"/>
                 <w:color w:val="16191F"/>
                 <w:sz w:val="19"/>
               </w:rPr>
@@ -3566,7 +3566,7 @@
           <w:p>
             <w:r>
               <w:rPr>
-                <w:rFonts w:ascii="Arial" w:hAnsi="Arial"/>
+                <w:rFonts w:ascii="Amazon Ember" w:hAnsi="Amazon Ember"/>
                 <w:color w:val="16191F"/>
                 <w:sz w:val="19"/>
               </w:rPr>
@@ -3584,7 +3584,7 @@
           <w:p>
             <w:r>
               <w:rPr>
-                <w:rFonts w:ascii="Arial" w:hAnsi="Arial"/>
+                <w:rFonts w:ascii="Amazon Ember" w:hAnsi="Amazon Ember"/>
                 <w:color w:val="16191F"/>
                 <w:sz w:val="19"/>
               </w:rPr>
@@ -3600,7 +3600,7 @@
           <w:p>
             <w:r>
               <w:rPr>
-                <w:rFonts w:ascii="Arial" w:hAnsi="Arial"/>
+                <w:rFonts w:ascii="Amazon Ember" w:hAnsi="Amazon Ember"/>
                 <w:color w:val="16191F"/>
                 <w:sz w:val="19"/>
               </w:rPr>
@@ -3616,7 +3616,7 @@
           <w:p>
             <w:r>
               <w:rPr>
-                <w:rFonts w:ascii="Arial" w:hAnsi="Arial"/>
+                <w:rFonts w:ascii="Amazon Ember" w:hAnsi="Amazon Ember"/>
                 <w:color w:val="16191F"/>
                 <w:sz w:val="19"/>
               </w:rPr>
@@ -3632,7 +3632,7 @@
           <w:p>
             <w:r>
               <w:rPr>
-                <w:rFonts w:ascii="Arial" w:hAnsi="Arial"/>
+                <w:rFonts w:ascii="Amazon Ember" w:hAnsi="Amazon Ember"/>
                 <w:color w:val="16191F"/>
                 <w:sz w:val="19"/>
               </w:rPr>
@@ -3648,7 +3648,7 @@
           <w:p>
             <w:r>
               <w:rPr>
-                <w:rFonts w:ascii="Arial" w:hAnsi="Arial"/>
+                <w:rFonts w:ascii="Amazon Ember" w:hAnsi="Amazon Ember"/>
                 <w:color w:val="16191F"/>
                 <w:sz w:val="19"/>
               </w:rPr>
@@ -3664,7 +3664,7 @@
           <w:p>
             <w:r>
               <w:rPr>
-                <w:rFonts w:ascii="Arial" w:hAnsi="Arial"/>
+                <w:rFonts w:ascii="Amazon Ember" w:hAnsi="Amazon Ember"/>
                 <w:color w:val="16191F"/>
                 <w:sz w:val="19"/>
               </w:rPr>
@@ -3682,7 +3682,7 @@
           <w:p>
             <w:r>
               <w:rPr>
-                <w:rFonts w:ascii="Arial" w:hAnsi="Arial"/>
+                <w:rFonts w:ascii="Amazon Ember" w:hAnsi="Amazon Ember"/>
                 <w:color w:val="16191F"/>
                 <w:sz w:val="19"/>
               </w:rPr>
@@ -3698,7 +3698,7 @@
           <w:p>
             <w:r>
               <w:rPr>
-                <w:rFonts w:ascii="Arial" w:hAnsi="Arial"/>
+                <w:rFonts w:ascii="Amazon Ember" w:hAnsi="Amazon Ember"/>
                 <w:color w:val="16191F"/>
                 <w:sz w:val="19"/>
               </w:rPr>
@@ -3714,7 +3714,7 @@
           <w:p>
             <w:r>
               <w:rPr>
-                <w:rFonts w:ascii="Arial" w:hAnsi="Arial"/>
+                <w:rFonts w:ascii="Amazon Ember" w:hAnsi="Amazon Ember"/>
                 <w:color w:val="16191F"/>
                 <w:sz w:val="19"/>
               </w:rPr>
@@ -3730,7 +3730,7 @@
           <w:p>
             <w:r>
               <w:rPr>
-                <w:rFonts w:ascii="Arial" w:hAnsi="Arial"/>
+                <w:rFonts w:ascii="Amazon Ember" w:hAnsi="Amazon Ember"/>
                 <w:color w:val="16191F"/>
                 <w:sz w:val="19"/>
               </w:rPr>
@@ -3746,7 +3746,7 @@
           <w:p>
             <w:r>
               <w:rPr>
-                <w:rFonts w:ascii="Arial" w:hAnsi="Arial"/>
+                <w:rFonts w:ascii="Amazon Ember" w:hAnsi="Amazon Ember"/>
                 <w:color w:val="16191F"/>
                 <w:sz w:val="19"/>
               </w:rPr>
@@ -3762,7 +3762,7 @@
           <w:p>
             <w:r>
               <w:rPr>
-                <w:rFonts w:ascii="Arial" w:hAnsi="Arial"/>
+                <w:rFonts w:ascii="Amazon Ember" w:hAnsi="Amazon Ember"/>
                 <w:color w:val="16191F"/>
                 <w:sz w:val="19"/>
               </w:rPr>
@@ -3780,7 +3780,7 @@
           <w:p>
             <w:r>
               <w:rPr>
-                <w:rFonts w:ascii="Arial" w:hAnsi="Arial"/>
+                <w:rFonts w:ascii="Amazon Ember" w:hAnsi="Amazon Ember"/>
                 <w:color w:val="16191F"/>
                 <w:sz w:val="19"/>
               </w:rPr>
@@ -3796,7 +3796,7 @@
           <w:p>
             <w:r>
               <w:rPr>
-                <w:rFonts w:ascii="Arial" w:hAnsi="Arial"/>
+                <w:rFonts w:ascii="Amazon Ember" w:hAnsi="Amazon Ember"/>
                 <w:color w:val="16191F"/>
                 <w:sz w:val="19"/>
               </w:rPr>
@@ -3812,7 +3812,7 @@
           <w:p>
             <w:r>
               <w:rPr>
-                <w:rFonts w:ascii="Arial" w:hAnsi="Arial"/>
+                <w:rFonts w:ascii="Amazon Ember" w:hAnsi="Amazon Ember"/>
                 <w:color w:val="16191F"/>
                 <w:sz w:val="19"/>
               </w:rPr>
@@ -3828,7 +3828,7 @@
           <w:p>
             <w:r>
               <w:rPr>
-                <w:rFonts w:ascii="Arial" w:hAnsi="Arial"/>
+                <w:rFonts w:ascii="Amazon Ember" w:hAnsi="Amazon Ember"/>
                 <w:color w:val="16191F"/>
                 <w:sz w:val="19"/>
               </w:rPr>
@@ -3844,7 +3844,7 @@
           <w:p>
             <w:r>
               <w:rPr>
-                <w:rFonts w:ascii="Arial" w:hAnsi="Arial"/>
+                <w:rFonts w:ascii="Amazon Ember" w:hAnsi="Amazon Ember"/>
                 <w:color w:val="16191F"/>
                 <w:sz w:val="19"/>
               </w:rPr>
@@ -3860,7 +3860,7 @@
           <w:p>
             <w:r>
               <w:rPr>
-                <w:rFonts w:ascii="Arial" w:hAnsi="Arial"/>
+                <w:rFonts w:ascii="Amazon Ember" w:hAnsi="Amazon Ember"/>
                 <w:color w:val="16191F"/>
                 <w:sz w:val="19"/>
               </w:rPr>
@@ -3878,7 +3878,7 @@
           <w:p>
             <w:r>
               <w:rPr>
-                <w:rFonts w:ascii="Arial" w:hAnsi="Arial"/>
+                <w:rFonts w:ascii="Amazon Ember" w:hAnsi="Amazon Ember"/>
                 <w:color w:val="16191F"/>
                 <w:sz w:val="19"/>
               </w:rPr>
@@ -3894,7 +3894,7 @@
           <w:p>
             <w:r>
               <w:rPr>
-                <w:rFonts w:ascii="Arial" w:hAnsi="Arial"/>
+                <w:rFonts w:ascii="Amazon Ember" w:hAnsi="Amazon Ember"/>
                 <w:color w:val="16191F"/>
                 <w:sz w:val="19"/>
               </w:rPr>
@@ -3910,7 +3910,7 @@
           <w:p>
             <w:r>
               <w:rPr>
-                <w:rFonts w:ascii="Arial" w:hAnsi="Arial"/>
+                <w:rFonts w:ascii="Amazon Ember" w:hAnsi="Amazon Ember"/>
                 <w:color w:val="16191F"/>
                 <w:sz w:val="19"/>
               </w:rPr>
@@ -3926,7 +3926,7 @@
           <w:p>
             <w:r>
               <w:rPr>
-                <w:rFonts w:ascii="Arial" w:hAnsi="Arial"/>
+                <w:rFonts w:ascii="Amazon Ember" w:hAnsi="Amazon Ember"/>
                 <w:color w:val="16191F"/>
                 <w:sz w:val="19"/>
               </w:rPr>
@@ -3942,7 +3942,7 @@
           <w:p>
             <w:r>
               <w:rPr>
-                <w:rFonts w:ascii="Arial" w:hAnsi="Arial"/>
+                <w:rFonts w:ascii="Amazon Ember" w:hAnsi="Amazon Ember"/>
                 <w:color w:val="16191F"/>
                 <w:sz w:val="19"/>
               </w:rPr>
@@ -3958,7 +3958,7 @@
           <w:p>
             <w:r>
               <w:rPr>
-                <w:rFonts w:ascii="Arial" w:hAnsi="Arial"/>
+                <w:rFonts w:ascii="Amazon Ember" w:hAnsi="Amazon Ember"/>
                 <w:color w:val="16191F"/>
                 <w:sz w:val="19"/>
               </w:rPr>
@@ -3976,7 +3976,7 @@
           <w:p>
             <w:r>
               <w:rPr>
-                <w:rFonts w:ascii="Arial" w:hAnsi="Arial"/>
+                <w:rFonts w:ascii="Amazon Ember" w:hAnsi="Amazon Ember"/>
                 <w:color w:val="16191F"/>
                 <w:sz w:val="19"/>
               </w:rPr>
@@ -3992,7 +3992,7 @@
           <w:p>
             <w:r>
               <w:rPr>
-                <w:rFonts w:ascii="Arial" w:hAnsi="Arial"/>
+                <w:rFonts w:ascii="Amazon Ember" w:hAnsi="Amazon Ember"/>
                 <w:color w:val="16191F"/>
                 <w:sz w:val="19"/>
               </w:rPr>
@@ -4008,7 +4008,7 @@
           <w:p>
             <w:r>
               <w:rPr>
-                <w:rFonts w:ascii="Arial" w:hAnsi="Arial"/>
+                <w:rFonts w:ascii="Amazon Ember" w:hAnsi="Amazon Ember"/>
                 <w:color w:val="16191F"/>
                 <w:sz w:val="19"/>
               </w:rPr>
@@ -4024,7 +4024,7 @@
           <w:p>
             <w:r>
               <w:rPr>
-                <w:rFonts w:ascii="Arial" w:hAnsi="Arial"/>
+                <w:rFonts w:ascii="Amazon Ember" w:hAnsi="Amazon Ember"/>
                 <w:color w:val="16191F"/>
                 <w:sz w:val="19"/>
               </w:rPr>
@@ -4040,7 +4040,7 @@
           <w:p>
             <w:r>
               <w:rPr>
-                <w:rFonts w:ascii="Arial" w:hAnsi="Arial"/>
+                <w:rFonts w:ascii="Amazon Ember" w:hAnsi="Amazon Ember"/>
                 <w:color w:val="16191F"/>
                 <w:sz w:val="19"/>
               </w:rPr>
@@ -4056,7 +4056,7 @@
           <w:p>
             <w:r>
               <w:rPr>
-                <w:rFonts w:ascii="Arial" w:hAnsi="Arial"/>
+                <w:rFonts w:ascii="Amazon Ember" w:hAnsi="Amazon Ember"/>
                 <w:color w:val="16191F"/>
                 <w:sz w:val="19"/>
               </w:rPr>
@@ -4074,7 +4074,7 @@
           <w:p>
             <w:r>
               <w:rPr>
-                <w:rFonts w:ascii="Arial" w:hAnsi="Arial"/>
+                <w:rFonts w:ascii="Amazon Ember" w:hAnsi="Amazon Ember"/>
                 <w:color w:val="16191F"/>
                 <w:sz w:val="19"/>
               </w:rPr>
@@ -4090,7 +4090,7 @@
           <w:p>
             <w:r>
               <w:rPr>
-                <w:rFonts w:ascii="Arial" w:hAnsi="Arial"/>
+                <w:rFonts w:ascii="Amazon Ember" w:hAnsi="Amazon Ember"/>
                 <w:color w:val="16191F"/>
                 <w:sz w:val="19"/>
               </w:rPr>
@@ -4106,7 +4106,7 @@
           <w:p>
             <w:r>
               <w:rPr>
-                <w:rFonts w:ascii="Arial" w:hAnsi="Arial"/>
+                <w:rFonts w:ascii="Amazon Ember" w:hAnsi="Amazon Ember"/>
                 <w:color w:val="16191F"/>
                 <w:sz w:val="19"/>
               </w:rPr>
@@ -4122,7 +4122,7 @@
           <w:p>
             <w:r>
               <w:rPr>
-                <w:rFonts w:ascii="Arial" w:hAnsi="Arial"/>
+                <w:rFonts w:ascii="Amazon Ember" w:hAnsi="Amazon Ember"/>
                 <w:color w:val="16191F"/>
                 <w:sz w:val="19"/>
               </w:rPr>
@@ -4138,7 +4138,7 @@
           <w:p>
             <w:r>
               <w:rPr>
-                <w:rFonts w:ascii="Arial" w:hAnsi="Arial"/>
+                <w:rFonts w:ascii="Amazon Ember" w:hAnsi="Amazon Ember"/>
                 <w:color w:val="16191F"/>
                 <w:sz w:val="19"/>
               </w:rPr>
@@ -4154,7 +4154,7 @@
           <w:p>
             <w:r>
               <w:rPr>
-                <w:rFonts w:ascii="Arial" w:hAnsi="Arial"/>
+                <w:rFonts w:ascii="Amazon Ember" w:hAnsi="Amazon Ember"/>
                 <w:color w:val="16191F"/>
                 <w:sz w:val="19"/>
               </w:rPr>
@@ -4171,7 +4171,7 @@
       </w:pPr>
       <w:r>
         <w:rPr>
-          <w:rFonts w:ascii="Arial" w:hAnsi="Arial"/>
+          <w:rFonts w:ascii="Amazon Ember" w:hAnsi="Amazon Ember"/>
           <w:color w:val="16191F"/>
           <w:sz w:val="21"/>
         </w:rPr>
@@ -4189,7 +4189,7 @@
       </w:pPr>
       <w:r>
         <w:rPr>
-          <w:rFonts w:ascii="Arial" w:hAnsi="Arial"/>
+          <w:rFonts w:ascii="Amazon Ember" w:hAnsi="Amazon Ember"/>
           <w:b/>
           <w:color w:val="0972D3"/>
           <w:sz w:val="28"/>
@@ -4203,7 +4203,7 @@
       </w:pPr>
       <w:r>
         <w:rPr>
-          <w:rFonts w:ascii="Arial" w:hAnsi="Arial"/>
+          <w:rFonts w:ascii="Amazon Ember" w:hAnsi="Amazon Ember"/>
           <w:color w:val="16191F"/>
           <w:sz w:val="21"/>
         </w:rPr>
@@ -4216,7 +4216,7 @@
       </w:pPr>
       <w:r>
         <w:rPr>
-          <w:rFonts w:ascii="Arial" w:hAnsi="Arial"/>
+          <w:rFonts w:ascii="Amazon Ember" w:hAnsi="Amazon Ember"/>
           <w:b/>
           <w:color w:val="0F1B2A"/>
           <w:sz w:val="24"/>
@@ -4230,7 +4230,7 @@
       </w:pPr>
       <w:r>
         <w:rPr>
-          <w:rFonts w:ascii="Arial" w:hAnsi="Arial"/>
+          <w:rFonts w:ascii="Amazon Ember" w:hAnsi="Amazon Ember"/>
           <w:color w:val="16191F"/>
           <w:sz w:val="21"/>
         </w:rPr>
@@ -4243,7 +4243,7 @@
       </w:pPr>
       <w:r>
         <w:rPr>
-          <w:rFonts w:ascii="Arial" w:hAnsi="Arial"/>
+          <w:rFonts w:ascii="Amazon Ember" w:hAnsi="Amazon Ember"/>
           <w:color w:val="16191F"/>
           <w:sz w:val="21"/>
         </w:rPr>
@@ -4256,7 +4256,7 @@
       </w:pPr>
       <w:r>
         <w:rPr>
-          <w:rFonts w:ascii="Arial" w:hAnsi="Arial"/>
+          <w:rFonts w:ascii="Amazon Ember" w:hAnsi="Amazon Ember"/>
           <w:color w:val="16191F"/>
           <w:sz w:val="21"/>
         </w:rPr>
@@ -4269,7 +4269,7 @@
       </w:pPr>
       <w:r>
         <w:rPr>
-          <w:rFonts w:ascii="Arial" w:hAnsi="Arial"/>
+          <w:rFonts w:ascii="Amazon Ember" w:hAnsi="Amazon Ember"/>
           <w:b/>
           <w:color w:val="0F1B2A"/>
           <w:sz w:val="24"/>
@@ -4283,7 +4283,7 @@
       </w:pPr>
       <w:r>
         <w:rPr>
-          <w:rFonts w:ascii="Arial" w:hAnsi="Arial"/>
+          <w:rFonts w:ascii="Amazon Ember" w:hAnsi="Amazon Ember"/>
           <w:color w:val="16191F"/>
           <w:sz w:val="21"/>
         </w:rPr>
@@ -4296,7 +4296,7 @@
       </w:pPr>
       <w:r>
         <w:rPr>
-          <w:rFonts w:ascii="Arial" w:hAnsi="Arial"/>
+          <w:rFonts w:ascii="Amazon Ember" w:hAnsi="Amazon Ember"/>
           <w:color w:val="16191F"/>
           <w:sz w:val="21"/>
         </w:rPr>
@@ -4309,7 +4309,7 @@
       </w:pPr>
       <w:r>
         <w:rPr>
-          <w:rFonts w:ascii="Arial" w:hAnsi="Arial"/>
+          <w:rFonts w:ascii="Amazon Ember" w:hAnsi="Amazon Ember"/>
           <w:color w:val="16191F"/>
           <w:sz w:val="21"/>
         </w:rPr>
@@ -4322,7 +4322,7 @@
       </w:pPr>
       <w:r>
         <w:rPr>
-          <w:rFonts w:ascii="Arial" w:hAnsi="Arial"/>
+          <w:rFonts w:ascii="Amazon Ember" w:hAnsi="Amazon Ember"/>
           <w:color w:val="16191F"/>
           <w:sz w:val="21"/>
         </w:rPr>
@@ -4335,7 +4335,7 @@
       </w:pPr>
       <w:r>
         <w:rPr>
-          <w:rFonts w:ascii="Arial" w:hAnsi="Arial"/>
+          <w:rFonts w:ascii="Amazon Ember" w:hAnsi="Amazon Ember"/>
           <w:color w:val="16191F"/>
           <w:sz w:val="21"/>
         </w:rPr>
@@ -4348,7 +4348,7 @@
       </w:pPr>
       <w:r>
         <w:rPr>
-          <w:rFonts w:ascii="Arial" w:hAnsi="Arial"/>
+          <w:rFonts w:ascii="Amazon Ember" w:hAnsi="Amazon Ember"/>
           <w:color w:val="16191F"/>
           <w:sz w:val="21"/>
         </w:rPr>
@@ -4361,7 +4361,7 @@
       </w:pPr>
       <w:r>
         <w:rPr>
-          <w:rFonts w:ascii="Arial" w:hAnsi="Arial"/>
+          <w:rFonts w:ascii="Amazon Ember" w:hAnsi="Amazon Ember"/>
           <w:color w:val="16191F"/>
           <w:sz w:val="21"/>
         </w:rPr>
@@ -4374,7 +4374,7 @@
       </w:pPr>
       <w:r>
         <w:rPr>
-          <w:rFonts w:ascii="Arial" w:hAnsi="Arial"/>
+          <w:rFonts w:ascii="Amazon Ember" w:hAnsi="Amazon Ember"/>
           <w:color w:val="16191F"/>
           <w:sz w:val="21"/>
         </w:rPr>
@@ -4387,7 +4387,7 @@
       </w:pPr>
       <w:r>
         <w:rPr>
-          <w:rFonts w:ascii="Arial" w:hAnsi="Arial"/>
+          <w:rFonts w:ascii="Amazon Ember" w:hAnsi="Amazon Ember"/>
           <w:color w:val="16191F"/>
           <w:sz w:val="21"/>
         </w:rPr>
@@ -4400,7 +4400,7 @@
       </w:pPr>
       <w:r>
         <w:rPr>
-          <w:rFonts w:ascii="Arial" w:hAnsi="Arial"/>
+          <w:rFonts w:ascii="Amazon Ember" w:hAnsi="Amazon Ember"/>
           <w:color w:val="16191F"/>
           <w:sz w:val="21"/>
         </w:rPr>
@@ -4413,7 +4413,7 @@
       </w:pPr>
       <w:r>
         <w:rPr>
-          <w:rFonts w:ascii="Arial" w:hAnsi="Arial"/>
+          <w:rFonts w:ascii="Amazon Ember" w:hAnsi="Amazon Ember"/>
           <w:color w:val="16191F"/>
           <w:sz w:val="21"/>
         </w:rPr>
@@ -4426,7 +4426,7 @@
       </w:pPr>
       <w:r>
         <w:rPr>
-          <w:rFonts w:ascii="Arial" w:hAnsi="Arial"/>
+          <w:rFonts w:ascii="Amazon Ember" w:hAnsi="Amazon Ember"/>
           <w:color w:val="16191F"/>
           <w:sz w:val="21"/>
         </w:rPr>
@@ -4439,7 +4439,7 @@
       </w:pPr>
       <w:r>
         <w:rPr>
-          <w:rFonts w:ascii="Arial" w:hAnsi="Arial"/>
+          <w:rFonts w:ascii="Amazon Ember" w:hAnsi="Amazon Ember"/>
           <w:color w:val="16191F"/>
           <w:sz w:val="21"/>
         </w:rPr>
@@ -4452,7 +4452,7 @@
       </w:pPr>
       <w:r>
         <w:rPr>
-          <w:rFonts w:ascii="Arial" w:hAnsi="Arial"/>
+          <w:rFonts w:ascii="Amazon Ember" w:hAnsi="Amazon Ember"/>
           <w:color w:val="16191F"/>
           <w:sz w:val="21"/>
         </w:rPr>
@@ -4465,7 +4465,7 @@
       </w:pPr>
       <w:r>
         <w:rPr>
-          <w:rFonts w:ascii="Arial" w:hAnsi="Arial"/>
+          <w:rFonts w:ascii="Amazon Ember" w:hAnsi="Amazon Ember"/>
           <w:color w:val="16191F"/>
           <w:sz w:val="21"/>
         </w:rPr>
@@ -4478,7 +4478,7 @@
       </w:pPr>
       <w:r>
         <w:rPr>
-          <w:rFonts w:ascii="Arial" w:hAnsi="Arial"/>
+          <w:rFonts w:ascii="Amazon Ember" w:hAnsi="Amazon Ember"/>
           <w:color w:val="16191F"/>
           <w:sz w:val="21"/>
         </w:rPr>
@@ -4491,7 +4491,7 @@
       </w:pPr>
       <w:r>
         <w:rPr>
-          <w:rFonts w:ascii="Arial" w:hAnsi="Arial"/>
+          <w:rFonts w:ascii="Amazon Ember" w:hAnsi="Amazon Ember"/>
           <w:color w:val="16191F"/>
           <w:sz w:val="21"/>
         </w:rPr>
@@ -4504,7 +4504,7 @@
       </w:pPr>
       <w:r>
         <w:rPr>
-          <w:rFonts w:ascii="Arial" w:hAnsi="Arial"/>
+          <w:rFonts w:ascii="Amazon Ember" w:hAnsi="Amazon Ember"/>
           <w:color w:val="16191F"/>
           <w:sz w:val="21"/>
         </w:rPr>
@@ -4517,7 +4517,7 @@
       </w:pPr>
       <w:r>
         <w:rPr>
-          <w:rFonts w:ascii="Arial" w:hAnsi="Arial"/>
+          <w:rFonts w:ascii="Amazon Ember" w:hAnsi="Amazon Ember"/>
           <w:color w:val="16191F"/>
           <w:sz w:val="21"/>
         </w:rPr>
@@ -4530,7 +4530,7 @@
       </w:pPr>
       <w:r>
         <w:rPr>
-          <w:rFonts w:ascii="Arial" w:hAnsi="Arial"/>
+          <w:rFonts w:ascii="Amazon Ember" w:hAnsi="Amazon Ember"/>
           <w:color w:val="16191F"/>
           <w:sz w:val="21"/>
         </w:rPr>
@@ -4543,7 +4543,7 @@
       </w:pPr>
       <w:r>
         <w:rPr>
-          <w:rFonts w:ascii="Arial" w:hAnsi="Arial"/>
+          <w:rFonts w:ascii="Amazon Ember" w:hAnsi="Amazon Ember"/>
           <w:color w:val="16191F"/>
           <w:sz w:val="21"/>
         </w:rPr>
@@ -4556,7 +4556,7 @@
       </w:pPr>
       <w:r>
         <w:rPr>
-          <w:rFonts w:ascii="Arial" w:hAnsi="Arial"/>
+          <w:rFonts w:ascii="Amazon Ember" w:hAnsi="Amazon Ember"/>
           <w:color w:val="16191F"/>
           <w:sz w:val="21"/>
         </w:rPr>
@@ -4569,7 +4569,7 @@
       </w:pPr>
       <w:r>
         <w:rPr>
-          <w:rFonts w:ascii="Arial" w:hAnsi="Arial"/>
+          <w:rFonts w:ascii="Amazon Ember" w:hAnsi="Amazon Ember"/>
           <w:color w:val="16191F"/>
           <w:sz w:val="21"/>
         </w:rPr>
@@ -4582,7 +4582,7 @@
       </w:pPr>
       <w:r>
         <w:rPr>
-          <w:rFonts w:ascii="Arial" w:hAnsi="Arial"/>
+          <w:rFonts w:ascii="Amazon Ember" w:hAnsi="Amazon Ember"/>
           <w:color w:val="16191F"/>
           <w:sz w:val="21"/>
         </w:rPr>
@@ -4595,7 +4595,7 @@
       </w:pPr>
       <w:r>
         <w:rPr>
-          <w:rFonts w:ascii="Arial" w:hAnsi="Arial"/>
+          <w:rFonts w:ascii="Amazon Ember" w:hAnsi="Amazon Ember"/>
           <w:color w:val="16191F"/>
           <w:sz w:val="21"/>
         </w:rPr>
@@ -4608,7 +4608,7 @@
       </w:pPr>
       <w:r>
         <w:rPr>
-          <w:rFonts w:ascii="Arial" w:hAnsi="Arial"/>
+          <w:rFonts w:ascii="Amazon Ember" w:hAnsi="Amazon Ember"/>
           <w:color w:val="16191F"/>
           <w:sz w:val="21"/>
         </w:rPr>
@@ -4621,7 +4621,7 @@
       </w:pPr>
       <w:r>
         <w:rPr>
-          <w:rFonts w:ascii="Arial" w:hAnsi="Arial"/>
+          <w:rFonts w:ascii="Amazon Ember" w:hAnsi="Amazon Ember"/>
           <w:color w:val="16191F"/>
           <w:sz w:val="21"/>
         </w:rPr>
@@ -4639,7 +4639,7 @@
       </w:pPr>
       <w:r>
         <w:rPr>
-          <w:rFonts w:ascii="Arial" w:hAnsi="Arial"/>
+          <w:rFonts w:ascii="Amazon Ember" w:hAnsi="Amazon Ember"/>
           <w:b/>
           <w:color w:val="0972D3"/>
           <w:sz w:val="28"/>
@@ -4653,7 +4653,7 @@
       </w:pPr>
       <w:r>
         <w:rPr>
-          <w:rFonts w:ascii="Consolas" w:hAnsi="Consolas"/>
+          <w:rFonts w:ascii="Amazon Ember Mono" w:hAnsi="Amazon Ember Mono"/>
           <w:color w:val="16191F"/>
           <w:sz w:val="18"/>
         </w:rPr>
@@ -4839,7 +4839,7 @@
       </w:pPr>
       <w:r>
         <w:rPr>
-          <w:rFonts w:ascii="Arial" w:hAnsi="Arial"/>
+          <w:rFonts w:ascii="Amazon Ember" w:hAnsi="Amazon Ember"/>
           <w:b/>
           <w:color w:val="0972D3"/>
           <w:sz w:val="28"/>
@@ -4853,7 +4853,7 @@
       </w:pPr>
       <w:r>
         <w:rPr>
-          <w:rFonts w:ascii="Arial" w:hAnsi="Arial"/>
+          <w:rFonts w:ascii="Amazon Ember" w:hAnsi="Amazon Ember"/>
           <w:b/>
           <w:color w:val="0F1B2A"/>
           <w:sz w:val="24"/>
@@ -4867,7 +4867,7 @@
       </w:pPr>
       <w:r>
         <w:rPr>
-          <w:rFonts w:ascii="Arial" w:hAnsi="Arial"/>
+          <w:rFonts w:ascii="Amazon Ember" w:hAnsi="Amazon Ember"/>
           <w:color w:val="16191F"/>
           <w:sz w:val="21"/>
         </w:rPr>
@@ -4880,7 +4880,7 @@
       </w:pPr>
       <w:r>
         <w:rPr>
-          <w:rFonts w:ascii="Arial" w:hAnsi="Arial"/>
+          <w:rFonts w:ascii="Amazon Ember" w:hAnsi="Amazon Ember"/>
           <w:color w:val="16191F"/>
           <w:sz w:val="21"/>
         </w:rPr>
@@ -4893,7 +4893,7 @@
       </w:pPr>
       <w:r>
         <w:rPr>
-          <w:rFonts w:ascii="Arial" w:hAnsi="Arial"/>
+          <w:rFonts w:ascii="Amazon Ember" w:hAnsi="Amazon Ember"/>
           <w:color w:val="16191F"/>
           <w:sz w:val="21"/>
         </w:rPr>
@@ -4906,7 +4906,7 @@
       </w:pPr>
       <w:r>
         <w:rPr>
-          <w:rFonts w:ascii="Arial" w:hAnsi="Arial"/>
+          <w:rFonts w:ascii="Amazon Ember" w:hAnsi="Amazon Ember"/>
           <w:b/>
           <w:color w:val="0F1B2A"/>
           <w:sz w:val="24"/>
@@ -4920,7 +4920,7 @@
       </w:pPr>
       <w:r>
         <w:rPr>
-          <w:rFonts w:ascii="Consolas" w:hAnsi="Consolas"/>
+          <w:rFonts w:ascii="Amazon Ember Mono" w:hAnsi="Amazon Ember Mono"/>
           <w:color w:val="16191F"/>
           <w:sz w:val="18"/>
         </w:rPr>
@@ -4957,7 +4957,7 @@
       </w:pPr>
       <w:r>
         <w:rPr>
-          <w:rFonts w:ascii="Arial" w:hAnsi="Arial"/>
+          <w:rFonts w:ascii="Amazon Ember" w:hAnsi="Amazon Ember"/>
           <w:color w:val="16191F"/>
           <w:sz w:val="21"/>
         </w:rPr>
@@ -4970,7 +4970,7 @@
       </w:pPr>
       <w:r>
         <w:rPr>
-          <w:rFonts w:ascii="Arial" w:hAnsi="Arial"/>
+          <w:rFonts w:ascii="Amazon Ember" w:hAnsi="Amazon Ember"/>
           <w:color w:val="16191F"/>
           <w:sz w:val="21"/>
         </w:rPr>
@@ -4983,7 +4983,7 @@
       </w:pPr>
       <w:r>
         <w:rPr>
-          <w:rFonts w:ascii="Arial" w:hAnsi="Arial"/>
+          <w:rFonts w:ascii="Amazon Ember" w:hAnsi="Amazon Ember"/>
           <w:b/>
           <w:color w:val="0F1B2A"/>
           <w:sz w:val="24"/>
@@ -4997,7 +4997,7 @@
       </w:pPr>
       <w:r>
         <w:rPr>
-          <w:rFonts w:ascii="Consolas" w:hAnsi="Consolas"/>
+          <w:rFonts w:ascii="Amazon Ember Mono" w:hAnsi="Amazon Ember Mono"/>
           <w:color w:val="16191F"/>
           <w:sz w:val="18"/>
         </w:rPr>
@@ -5022,7 +5022,7 @@
       </w:pPr>
       <w:r>
         <w:rPr>
-          <w:rFonts w:ascii="Arial" w:hAnsi="Arial"/>
+          <w:rFonts w:ascii="Amazon Ember" w:hAnsi="Amazon Ember"/>
           <w:color w:val="16191F"/>
           <w:sz w:val="21"/>
         </w:rPr>
@@ -5035,7 +5035,7 @@
       </w:pPr>
       <w:r>
         <w:rPr>
-          <w:rFonts w:ascii="Arial" w:hAnsi="Arial"/>
+          <w:rFonts w:ascii="Amazon Ember" w:hAnsi="Amazon Ember"/>
           <w:b/>
           <w:color w:val="0F1B2A"/>
           <w:sz w:val="24"/>
@@ -5049,7 +5049,7 @@
       </w:pPr>
       <w:r>
         <w:rPr>
-          <w:rFonts w:ascii="Arial" w:hAnsi="Arial"/>
+          <w:rFonts w:ascii="Amazon Ember" w:hAnsi="Amazon Ember"/>
           <w:color w:val="16191F"/>
           <w:sz w:val="21"/>
         </w:rPr>
@@ -5062,7 +5062,7 @@
       </w:pPr>
       <w:r>
         <w:rPr>
-          <w:rFonts w:ascii="Arial" w:hAnsi="Arial"/>
+          <w:rFonts w:ascii="Amazon Ember" w:hAnsi="Amazon Ember"/>
           <w:color w:val="16191F"/>
           <w:sz w:val="21"/>
         </w:rPr>
@@ -5075,7 +5075,7 @@
       </w:pPr>
       <w:r>
         <w:rPr>
-          <w:rFonts w:ascii="Arial" w:hAnsi="Arial"/>
+          <w:rFonts w:ascii="Amazon Ember" w:hAnsi="Amazon Ember"/>
           <w:color w:val="16191F"/>
           <w:sz w:val="21"/>
         </w:rPr>
@@ -5088,7 +5088,7 @@
       </w:pPr>
       <w:r>
         <w:rPr>
-          <w:rFonts w:ascii="Consolas" w:hAnsi="Consolas"/>
+          <w:rFonts w:ascii="Amazon Ember Mono" w:hAnsi="Amazon Ember Mono"/>
           <w:color w:val="16191F"/>
           <w:sz w:val="18"/>
         </w:rPr>
@@ -5101,7 +5101,7 @@
       </w:pPr>
       <w:r>
         <w:rPr>
-          <w:rFonts w:ascii="Arial" w:hAnsi="Arial"/>
+          <w:rFonts w:ascii="Amazon Ember" w:hAnsi="Amazon Ember"/>
           <w:color w:val="16191F"/>
           <w:sz w:val="21"/>
         </w:rPr>
@@ -5119,7 +5119,7 @@
       </w:pPr>
       <w:r>
         <w:rPr>
-          <w:rFonts w:ascii="Arial" w:hAnsi="Arial"/>
+          <w:rFonts w:ascii="Amazon Ember" w:hAnsi="Amazon Ember"/>
           <w:b/>
           <w:color w:val="0972D3"/>
           <w:sz w:val="28"/>
@@ -5133,7 +5133,7 @@
       </w:pPr>
       <w:r>
         <w:rPr>
-          <w:rFonts w:ascii="Arial" w:hAnsi="Arial"/>
+          <w:rFonts w:ascii="Amazon Ember" w:hAnsi="Amazon Ember"/>
           <w:b/>
           <w:color w:val="0F1B2A"/>
           <w:sz w:val="24"/>
@@ -5147,7 +5147,7 @@
       </w:pPr>
       <w:r>
         <w:rPr>
-          <w:rFonts w:ascii="Arial" w:hAnsi="Arial"/>
+          <w:rFonts w:ascii="Amazon Ember" w:hAnsi="Amazon Ember"/>
           <w:color w:val="16191F"/>
           <w:sz w:val="21"/>
         </w:rPr>
@@ -5160,7 +5160,7 @@
       </w:pPr>
       <w:r>
         <w:rPr>
-          <w:rFonts w:ascii="Consolas" w:hAnsi="Consolas"/>
+          <w:rFonts w:ascii="Amazon Ember Mono" w:hAnsi="Amazon Ember Mono"/>
           <w:color w:val="16191F"/>
           <w:sz w:val="18"/>
         </w:rPr>
@@ -5201,7 +5201,7 @@
       </w:pPr>
       <w:r>
         <w:rPr>
-          <w:rFonts w:ascii="Arial" w:hAnsi="Arial"/>
+          <w:rFonts w:ascii="Amazon Ember" w:hAnsi="Amazon Ember"/>
           <w:color w:val="16191F"/>
           <w:sz w:val="21"/>
         </w:rPr>
@@ -5214,7 +5214,7 @@
       </w:pPr>
       <w:r>
         <w:rPr>
-          <w:rFonts w:ascii="Arial" w:hAnsi="Arial"/>
+          <w:rFonts w:ascii="Amazon Ember" w:hAnsi="Amazon Ember"/>
           <w:color w:val="16191F"/>
           <w:sz w:val="21"/>
         </w:rPr>
@@ -5227,7 +5227,7 @@
       </w:pPr>
       <w:r>
         <w:rPr>
-          <w:rFonts w:ascii="Arial" w:hAnsi="Arial"/>
+          <w:rFonts w:ascii="Amazon Ember" w:hAnsi="Amazon Ember"/>
           <w:color w:val="16191F"/>
           <w:sz w:val="21"/>
         </w:rPr>
@@ -5240,7 +5240,7 @@
       </w:pPr>
       <w:r>
         <w:rPr>
-          <w:rFonts w:ascii="Arial" w:hAnsi="Arial"/>
+          <w:rFonts w:ascii="Amazon Ember" w:hAnsi="Amazon Ember"/>
           <w:color w:val="16191F"/>
           <w:sz w:val="21"/>
         </w:rPr>
@@ -5253,7 +5253,7 @@
       </w:pPr>
       <w:r>
         <w:rPr>
-          <w:rFonts w:ascii="Arial" w:hAnsi="Arial"/>
+          <w:rFonts w:ascii="Amazon Ember" w:hAnsi="Amazon Ember"/>
           <w:color w:val="16191F"/>
           <w:sz w:val="21"/>
         </w:rPr>
@@ -5266,7 +5266,7 @@
       </w:pPr>
       <w:r>
         <w:rPr>
-          <w:rFonts w:ascii="Arial" w:hAnsi="Arial"/>
+          <w:rFonts w:ascii="Amazon Ember" w:hAnsi="Amazon Ember"/>
           <w:color w:val="16191F"/>
           <w:sz w:val="21"/>
         </w:rPr>
@@ -5284,7 +5284,7 @@
       </w:pPr>
       <w:r>
         <w:rPr>
-          <w:rFonts w:ascii="Arial" w:hAnsi="Arial"/>
+          <w:rFonts w:ascii="Amazon Ember" w:hAnsi="Amazon Ember"/>
           <w:b/>
           <w:color w:val="0F1B2A"/>
           <w:sz w:val="24"/>
@@ -5317,7 +5317,7 @@
             </w:pPr>
             <w:r>
               <w:rPr>
-                <w:rFonts w:ascii="Arial" w:hAnsi="Arial"/>
+                <w:rFonts w:ascii="Amazon Ember" w:hAnsi="Amazon Ember"/>
                 <w:b/>
                 <w:color w:val="FFFFFF"/>
                 <w:sz w:val="20"/>
@@ -5337,7 +5337,7 @@
             </w:pPr>
             <w:r>
               <w:rPr>
-                <w:rFonts w:ascii="Arial" w:hAnsi="Arial"/>
+                <w:rFonts w:ascii="Amazon Ember" w:hAnsi="Amazon Ember"/>
                 <w:b/>
                 <w:color w:val="FFFFFF"/>
                 <w:sz w:val="20"/>
@@ -5357,7 +5357,7 @@
             </w:pPr>
             <w:r>
               <w:rPr>
-                <w:rFonts w:ascii="Arial" w:hAnsi="Arial"/>
+                <w:rFonts w:ascii="Amazon Ember" w:hAnsi="Amazon Ember"/>
                 <w:b/>
                 <w:color w:val="FFFFFF"/>
                 <w:sz w:val="20"/>
@@ -5377,7 +5377,7 @@
             </w:pPr>
             <w:r>
               <w:rPr>
-                <w:rFonts w:ascii="Arial" w:hAnsi="Arial"/>
+                <w:rFonts w:ascii="Amazon Ember" w:hAnsi="Amazon Ember"/>
                 <w:b/>
                 <w:color w:val="FFFFFF"/>
                 <w:sz w:val="20"/>
@@ -5397,7 +5397,7 @@
             </w:pPr>
             <w:r>
               <w:rPr>
-                <w:rFonts w:ascii="Arial" w:hAnsi="Arial"/>
+                <w:rFonts w:ascii="Amazon Ember" w:hAnsi="Amazon Ember"/>
                 <w:b/>
                 <w:color w:val="FFFFFF"/>
                 <w:sz w:val="20"/>
@@ -5416,7 +5416,7 @@
           <w:p>
             <w:r>
               <w:rPr>
-                <w:rFonts w:ascii="Arial" w:hAnsi="Arial"/>
+                <w:rFonts w:ascii="Amazon Ember" w:hAnsi="Amazon Ember"/>
                 <w:color w:val="16191F"/>
                 <w:sz w:val="19"/>
               </w:rPr>
@@ -5432,7 +5432,7 @@
           <w:p>
             <w:r>
               <w:rPr>
-                <w:rFonts w:ascii="Arial" w:hAnsi="Arial"/>
+                <w:rFonts w:ascii="Amazon Ember" w:hAnsi="Amazon Ember"/>
                 <w:color w:val="16191F"/>
                 <w:sz w:val="19"/>
               </w:rPr>
@@ -5448,7 +5448,7 @@
           <w:p>
             <w:r>
               <w:rPr>
-                <w:rFonts w:ascii="Arial" w:hAnsi="Arial"/>
+                <w:rFonts w:ascii="Amazon Ember" w:hAnsi="Amazon Ember"/>
                 <w:color w:val="16191F"/>
                 <w:sz w:val="19"/>
               </w:rPr>
@@ -5464,7 +5464,7 @@
           <w:p>
             <w:r>
               <w:rPr>
-                <w:rFonts w:ascii="Arial" w:hAnsi="Arial"/>
+                <w:rFonts w:ascii="Amazon Ember" w:hAnsi="Amazon Ember"/>
                 <w:color w:val="16191F"/>
                 <w:sz w:val="19"/>
               </w:rPr>
@@ -5480,7 +5480,7 @@
           <w:p>
             <w:r>
               <w:rPr>
-                <w:rFonts w:ascii="Arial" w:hAnsi="Arial"/>
+                <w:rFonts w:ascii="Amazon Ember" w:hAnsi="Amazon Ember"/>
                 <w:color w:val="16191F"/>
                 <w:sz w:val="19"/>
               </w:rPr>
@@ -5498,7 +5498,7 @@
           <w:p>
             <w:r>
               <w:rPr>
-                <w:rFonts w:ascii="Arial" w:hAnsi="Arial"/>
+                <w:rFonts w:ascii="Amazon Ember" w:hAnsi="Amazon Ember"/>
                 <w:color w:val="16191F"/>
                 <w:sz w:val="19"/>
               </w:rPr>
@@ -5514,7 +5514,7 @@
           <w:p>
             <w:r>
               <w:rPr>
-                <w:rFonts w:ascii="Arial" w:hAnsi="Arial"/>
+                <w:rFonts w:ascii="Amazon Ember" w:hAnsi="Amazon Ember"/>
                 <w:color w:val="16191F"/>
                 <w:sz w:val="19"/>
               </w:rPr>
@@ -5530,7 +5530,7 @@
           <w:p>
             <w:r>
               <w:rPr>
-                <w:rFonts w:ascii="Arial" w:hAnsi="Arial"/>
+                <w:rFonts w:ascii="Amazon Ember" w:hAnsi="Amazon Ember"/>
                 <w:color w:val="16191F"/>
                 <w:sz w:val="19"/>
               </w:rPr>
@@ -5546,7 +5546,7 @@
           <w:p>
             <w:r>
               <w:rPr>
-                <w:rFonts w:ascii="Arial" w:hAnsi="Arial"/>
+                <w:rFonts w:ascii="Amazon Ember" w:hAnsi="Amazon Ember"/>
                 <w:color w:val="16191F"/>
                 <w:sz w:val="19"/>
               </w:rPr>
@@ -5562,7 +5562,7 @@
           <w:p>
             <w:r>
               <w:rPr>
-                <w:rFonts w:ascii="Arial" w:hAnsi="Arial"/>
+                <w:rFonts w:ascii="Amazon Ember" w:hAnsi="Amazon Ember"/>
                 <w:color w:val="16191F"/>
                 <w:sz w:val="19"/>
               </w:rPr>
@@ -5580,7 +5580,7 @@
           <w:p>
             <w:r>
               <w:rPr>
-                <w:rFonts w:ascii="Arial" w:hAnsi="Arial"/>
+                <w:rFonts w:ascii="Amazon Ember" w:hAnsi="Amazon Ember"/>
                 <w:color w:val="16191F"/>
                 <w:sz w:val="19"/>
               </w:rPr>
@@ -5596,7 +5596,7 @@
           <w:p>
             <w:r>
               <w:rPr>
-                <w:rFonts w:ascii="Arial" w:hAnsi="Arial"/>
+                <w:rFonts w:ascii="Amazon Ember" w:hAnsi="Amazon Ember"/>
                 <w:color w:val="16191F"/>
                 <w:sz w:val="19"/>
               </w:rPr>
@@ -5612,7 +5612,7 @@
           <w:p>
             <w:r>
               <w:rPr>
-                <w:rFonts w:ascii="Arial" w:hAnsi="Arial"/>
+                <w:rFonts w:ascii="Amazon Ember" w:hAnsi="Amazon Ember"/>
                 <w:color w:val="16191F"/>
                 <w:sz w:val="19"/>
               </w:rPr>
@@ -5628,7 +5628,7 @@
           <w:p>
             <w:r>
               <w:rPr>
-                <w:rFonts w:ascii="Arial" w:hAnsi="Arial"/>
+                <w:rFonts w:ascii="Amazon Ember" w:hAnsi="Amazon Ember"/>
                 <w:color w:val="16191F"/>
                 <w:sz w:val="19"/>
               </w:rPr>
@@ -5644,7 +5644,7 @@
           <w:p>
             <w:r>
               <w:rPr>
-                <w:rFonts w:ascii="Arial" w:hAnsi="Arial"/>
+                <w:rFonts w:ascii="Amazon Ember" w:hAnsi="Amazon Ember"/>
                 <w:color w:val="16191F"/>
                 <w:sz w:val="19"/>
               </w:rPr>
@@ -5662,7 +5662,7 @@
           <w:p>
             <w:r>
               <w:rPr>
-                <w:rFonts w:ascii="Arial" w:hAnsi="Arial"/>
+                <w:rFonts w:ascii="Amazon Ember" w:hAnsi="Amazon Ember"/>
                 <w:color w:val="16191F"/>
                 <w:sz w:val="19"/>
               </w:rPr>
@@ -5678,7 +5678,7 @@
           <w:p>
             <w:r>
               <w:rPr>
-                <w:rFonts w:ascii="Arial" w:hAnsi="Arial"/>
+                <w:rFonts w:ascii="Amazon Ember" w:hAnsi="Amazon Ember"/>
                 <w:color w:val="16191F"/>
                 <w:sz w:val="19"/>
               </w:rPr>
@@ -5694,7 +5694,7 @@
           <w:p>
             <w:r>
               <w:rPr>
-                <w:rFonts w:ascii="Arial" w:hAnsi="Arial"/>
+                <w:rFonts w:ascii="Amazon Ember" w:hAnsi="Amazon Ember"/>
                 <w:color w:val="16191F"/>
                 <w:sz w:val="19"/>
               </w:rPr>
@@ -5710,7 +5710,7 @@
           <w:p>
             <w:r>
               <w:rPr>
-                <w:rFonts w:ascii="Arial" w:hAnsi="Arial"/>
+                <w:rFonts w:ascii="Amazon Ember" w:hAnsi="Amazon Ember"/>
                 <w:color w:val="16191F"/>
                 <w:sz w:val="19"/>
               </w:rPr>
@@ -5726,7 +5726,7 @@
           <w:p>
             <w:r>
               <w:rPr>
-                <w:rFonts w:ascii="Arial" w:hAnsi="Arial"/>
+                <w:rFonts w:ascii="Amazon Ember" w:hAnsi="Amazon Ember"/>
                 <w:color w:val="16191F"/>
                 <w:sz w:val="19"/>
               </w:rPr>
@@ -5744,7 +5744,7 @@
           <w:p>
             <w:r>
               <w:rPr>
-                <w:rFonts w:ascii="Arial" w:hAnsi="Arial"/>
+                <w:rFonts w:ascii="Amazon Ember" w:hAnsi="Amazon Ember"/>
                 <w:color w:val="16191F"/>
                 <w:sz w:val="19"/>
               </w:rPr>
@@ -5760,7 +5760,7 @@
           <w:p>
             <w:r>
               <w:rPr>
-                <w:rFonts w:ascii="Arial" w:hAnsi="Arial"/>
+                <w:rFonts w:ascii="Amazon Ember" w:hAnsi="Amazon Ember"/>
                 <w:color w:val="16191F"/>
                 <w:sz w:val="19"/>
               </w:rPr>
@@ -5776,7 +5776,7 @@
           <w:p>
             <w:r>
               <w:rPr>
-                <w:rFonts w:ascii="Arial" w:hAnsi="Arial"/>
+                <w:rFonts w:ascii="Amazon Ember" w:hAnsi="Amazon Ember"/>
                 <w:color w:val="16191F"/>
                 <w:sz w:val="19"/>
               </w:rPr>
@@ -5792,7 +5792,7 @@
           <w:p>
             <w:r>
               <w:rPr>
-                <w:rFonts w:ascii="Arial" w:hAnsi="Arial"/>
+                <w:rFonts w:ascii="Amazon Ember" w:hAnsi="Amazon Ember"/>
                 <w:color w:val="16191F"/>
                 <w:sz w:val="19"/>
               </w:rPr>
@@ -5808,7 +5808,7 @@
           <w:p>
             <w:r>
               <w:rPr>
-                <w:rFonts w:ascii="Arial" w:hAnsi="Arial"/>
+                <w:rFonts w:ascii="Amazon Ember" w:hAnsi="Amazon Ember"/>
                 <w:color w:val="16191F"/>
                 <w:sz w:val="19"/>
               </w:rPr>
@@ -5826,7 +5826,7 @@
           <w:p>
             <w:r>
               <w:rPr>
-                <w:rFonts w:ascii="Arial" w:hAnsi="Arial"/>
+                <w:rFonts w:ascii="Amazon Ember" w:hAnsi="Amazon Ember"/>
                 <w:color w:val="16191F"/>
                 <w:sz w:val="19"/>
               </w:rPr>
@@ -5842,7 +5842,7 @@
           <w:p>
             <w:r>
               <w:rPr>
-                <w:rFonts w:ascii="Arial" w:hAnsi="Arial"/>
+                <w:rFonts w:ascii="Amazon Ember" w:hAnsi="Amazon Ember"/>
                 <w:color w:val="16191F"/>
                 <w:sz w:val="19"/>
               </w:rPr>
@@ -5858,7 +5858,7 @@
           <w:p>
             <w:r>
               <w:rPr>
-                <w:rFonts w:ascii="Arial" w:hAnsi="Arial"/>
+                <w:rFonts w:ascii="Amazon Ember" w:hAnsi="Amazon Ember"/>
                 <w:color w:val="16191F"/>
                 <w:sz w:val="19"/>
               </w:rPr>
@@ -5874,7 +5874,7 @@
           <w:p>
             <w:r>
               <w:rPr>
-                <w:rFonts w:ascii="Arial" w:hAnsi="Arial"/>
+                <w:rFonts w:ascii="Amazon Ember" w:hAnsi="Amazon Ember"/>
                 <w:color w:val="16191F"/>
                 <w:sz w:val="19"/>
               </w:rPr>
@@ -5890,7 +5890,7 @@
           <w:p>
             <w:r>
               <w:rPr>
-                <w:rFonts w:ascii="Arial" w:hAnsi="Arial"/>
+                <w:rFonts w:ascii="Amazon Ember" w:hAnsi="Amazon Ember"/>
                 <w:color w:val="16191F"/>
                 <w:sz w:val="19"/>
               </w:rPr>
@@ -5908,7 +5908,7 @@
           <w:p>
             <w:r>
               <w:rPr>
-                <w:rFonts w:ascii="Arial" w:hAnsi="Arial"/>
+                <w:rFonts w:ascii="Amazon Ember" w:hAnsi="Amazon Ember"/>
                 <w:color w:val="16191F"/>
                 <w:sz w:val="19"/>
               </w:rPr>
@@ -5924,7 +5924,7 @@
           <w:p>
             <w:r>
               <w:rPr>
-                <w:rFonts w:ascii="Arial" w:hAnsi="Arial"/>
+                <w:rFonts w:ascii="Amazon Ember" w:hAnsi="Amazon Ember"/>
                 <w:color w:val="16191F"/>
                 <w:sz w:val="19"/>
               </w:rPr>
@@ -5940,7 +5940,7 @@
           <w:p>
             <w:r>
               <w:rPr>
-                <w:rFonts w:ascii="Arial" w:hAnsi="Arial"/>
+                <w:rFonts w:ascii="Amazon Ember" w:hAnsi="Amazon Ember"/>
                 <w:color w:val="16191F"/>
                 <w:sz w:val="19"/>
               </w:rPr>
@@ -5956,7 +5956,7 @@
           <w:p>
             <w:r>
               <w:rPr>
-                <w:rFonts w:ascii="Arial" w:hAnsi="Arial"/>
+                <w:rFonts w:ascii="Amazon Ember" w:hAnsi="Amazon Ember"/>
                 <w:color w:val="16191F"/>
                 <w:sz w:val="19"/>
               </w:rPr>
@@ -5972,7 +5972,7 @@
           <w:p>
             <w:r>
               <w:rPr>
-                <w:rFonts w:ascii="Arial" w:hAnsi="Arial"/>
+                <w:rFonts w:ascii="Amazon Ember" w:hAnsi="Amazon Ember"/>
                 <w:color w:val="16191F"/>
                 <w:sz w:val="19"/>
               </w:rPr>
@@ -5990,7 +5990,7 @@
           <w:p>
             <w:r>
               <w:rPr>
-                <w:rFonts w:ascii="Arial" w:hAnsi="Arial"/>
+                <w:rFonts w:ascii="Amazon Ember" w:hAnsi="Amazon Ember"/>
                 <w:color w:val="16191F"/>
                 <w:sz w:val="19"/>
               </w:rPr>
@@ -6006,7 +6006,7 @@
           <w:p>
             <w:r>
               <w:rPr>
-                <w:rFonts w:ascii="Arial" w:hAnsi="Arial"/>
+                <w:rFonts w:ascii="Amazon Ember" w:hAnsi="Amazon Ember"/>
                 <w:color w:val="16191F"/>
                 <w:sz w:val="19"/>
               </w:rPr>
@@ -6022,7 +6022,7 @@
           <w:p>
             <w:r>
               <w:rPr>
-                <w:rFonts w:ascii="Arial" w:hAnsi="Arial"/>
+                <w:rFonts w:ascii="Amazon Ember" w:hAnsi="Amazon Ember"/>
                 <w:color w:val="16191F"/>
                 <w:sz w:val="19"/>
               </w:rPr>
@@ -6038,7 +6038,7 @@
           <w:p>
             <w:r>
               <w:rPr>
-                <w:rFonts w:ascii="Arial" w:hAnsi="Arial"/>
+                <w:rFonts w:ascii="Amazon Ember" w:hAnsi="Amazon Ember"/>
                 <w:color w:val="16191F"/>
                 <w:sz w:val="19"/>
               </w:rPr>
@@ -6054,7 +6054,7 @@
           <w:p>
             <w:r>
               <w:rPr>
-                <w:rFonts w:ascii="Arial" w:hAnsi="Arial"/>
+                <w:rFonts w:ascii="Amazon Ember" w:hAnsi="Amazon Ember"/>
                 <w:color w:val="16191F"/>
                 <w:sz w:val="19"/>
               </w:rPr>
@@ -6072,7 +6072,7 @@
           <w:p>
             <w:r>
               <w:rPr>
-                <w:rFonts w:ascii="Arial" w:hAnsi="Arial"/>
+                <w:rFonts w:ascii="Amazon Ember" w:hAnsi="Amazon Ember"/>
                 <w:color w:val="16191F"/>
                 <w:sz w:val="19"/>
               </w:rPr>
@@ -6088,7 +6088,7 @@
           <w:p>
             <w:r>
               <w:rPr>
-                <w:rFonts w:ascii="Arial" w:hAnsi="Arial"/>
+                <w:rFonts w:ascii="Amazon Ember" w:hAnsi="Amazon Ember"/>
                 <w:color w:val="16191F"/>
                 <w:sz w:val="19"/>
               </w:rPr>
@@ -6104,7 +6104,7 @@
           <w:p>
             <w:r>
               <w:rPr>
-                <w:rFonts w:ascii="Arial" w:hAnsi="Arial"/>
+                <w:rFonts w:ascii="Amazon Ember" w:hAnsi="Amazon Ember"/>
                 <w:color w:val="16191F"/>
                 <w:sz w:val="19"/>
               </w:rPr>
@@ -6120,7 +6120,7 @@
           <w:p>
             <w:r>
               <w:rPr>
-                <w:rFonts w:ascii="Arial" w:hAnsi="Arial"/>
+                <w:rFonts w:ascii="Amazon Ember" w:hAnsi="Amazon Ember"/>
                 <w:color w:val="16191F"/>
                 <w:sz w:val="19"/>
               </w:rPr>
@@ -6136,7 +6136,7 @@
           <w:p>
             <w:r>
               <w:rPr>
-                <w:rFonts w:ascii="Arial" w:hAnsi="Arial"/>
+                <w:rFonts w:ascii="Amazon Ember" w:hAnsi="Amazon Ember"/>
                 <w:color w:val="16191F"/>
                 <w:sz w:val="19"/>
               </w:rPr>
@@ -6154,7 +6154,7 @@
           <w:p>
             <w:r>
               <w:rPr>
-                <w:rFonts w:ascii="Arial" w:hAnsi="Arial"/>
+                <w:rFonts w:ascii="Amazon Ember" w:hAnsi="Amazon Ember"/>
                 <w:color w:val="16191F"/>
                 <w:sz w:val="19"/>
               </w:rPr>
@@ -6170,7 +6170,7 @@
           <w:p>
             <w:r>
               <w:rPr>
-                <w:rFonts w:ascii="Arial" w:hAnsi="Arial"/>
+                <w:rFonts w:ascii="Amazon Ember" w:hAnsi="Amazon Ember"/>
                 <w:color w:val="16191F"/>
                 <w:sz w:val="19"/>
               </w:rPr>
@@ -6186,7 +6186,7 @@
           <w:p>
             <w:r>
               <w:rPr>
-                <w:rFonts w:ascii="Arial" w:hAnsi="Arial"/>
+                <w:rFonts w:ascii="Amazon Ember" w:hAnsi="Amazon Ember"/>
                 <w:color w:val="16191F"/>
                 <w:sz w:val="19"/>
               </w:rPr>
@@ -6202,7 +6202,7 @@
           <w:p>
             <w:r>
               <w:rPr>
-                <w:rFonts w:ascii="Arial" w:hAnsi="Arial"/>
+                <w:rFonts w:ascii="Amazon Ember" w:hAnsi="Amazon Ember"/>
                 <w:color w:val="16191F"/>
                 <w:sz w:val="19"/>
               </w:rPr>
@@ -6218,7 +6218,7 @@
           <w:p>
             <w:r>
               <w:rPr>
-                <w:rFonts w:ascii="Arial" w:hAnsi="Arial"/>
+                <w:rFonts w:ascii="Amazon Ember" w:hAnsi="Amazon Ember"/>
                 <w:color w:val="16191F"/>
                 <w:sz w:val="19"/>
               </w:rPr>
@@ -6236,7 +6236,7 @@
           <w:p>
             <w:r>
               <w:rPr>
-                <w:rFonts w:ascii="Arial" w:hAnsi="Arial"/>
+                <w:rFonts w:ascii="Amazon Ember" w:hAnsi="Amazon Ember"/>
                 <w:color w:val="16191F"/>
                 <w:sz w:val="19"/>
               </w:rPr>
@@ -6252,7 +6252,7 @@
           <w:p>
             <w:r>
               <w:rPr>
-                <w:rFonts w:ascii="Arial" w:hAnsi="Arial"/>
+                <w:rFonts w:ascii="Amazon Ember" w:hAnsi="Amazon Ember"/>
                 <w:color w:val="16191F"/>
                 <w:sz w:val="19"/>
               </w:rPr>
@@ -6268,7 +6268,7 @@
           <w:p>
             <w:r>
               <w:rPr>
-                <w:rFonts w:ascii="Arial" w:hAnsi="Arial"/>
+                <w:rFonts w:ascii="Amazon Ember" w:hAnsi="Amazon Ember"/>
                 <w:color w:val="16191F"/>
                 <w:sz w:val="19"/>
               </w:rPr>
@@ -6284,7 +6284,7 @@
           <w:p>
             <w:r>
               <w:rPr>
-                <w:rFonts w:ascii="Arial" w:hAnsi="Arial"/>
+                <w:rFonts w:ascii="Amazon Ember" w:hAnsi="Amazon Ember"/>
                 <w:color w:val="16191F"/>
                 <w:sz w:val="19"/>
               </w:rPr>
@@ -6300,7 +6300,7 @@
           <w:p>
             <w:r>
               <w:rPr>
-                <w:rFonts w:ascii="Arial" w:hAnsi="Arial"/>
+                <w:rFonts w:ascii="Amazon Ember" w:hAnsi="Amazon Ember"/>
                 <w:color w:val="16191F"/>
                 <w:sz w:val="19"/>
               </w:rPr>
@@ -6318,7 +6318,7 @@
           <w:p>
             <w:r>
               <w:rPr>
-                <w:rFonts w:ascii="Arial" w:hAnsi="Arial"/>
+                <w:rFonts w:ascii="Amazon Ember" w:hAnsi="Amazon Ember"/>
                 <w:color w:val="16191F"/>
                 <w:sz w:val="19"/>
               </w:rPr>
@@ -6334,7 +6334,7 @@
           <w:p>
             <w:r>
               <w:rPr>
-                <w:rFonts w:ascii="Arial" w:hAnsi="Arial"/>
+                <w:rFonts w:ascii="Amazon Ember" w:hAnsi="Amazon Ember"/>
                 <w:color w:val="16191F"/>
                 <w:sz w:val="19"/>
               </w:rPr>
@@ -6350,7 +6350,7 @@
           <w:p>
             <w:r>
               <w:rPr>
-                <w:rFonts w:ascii="Arial" w:hAnsi="Arial"/>
+                <w:rFonts w:ascii="Amazon Ember" w:hAnsi="Amazon Ember"/>
                 <w:color w:val="16191F"/>
                 <w:sz w:val="19"/>
               </w:rPr>
@@ -6366,7 +6366,7 @@
           <w:p>
             <w:r>
               <w:rPr>
-                <w:rFonts w:ascii="Arial" w:hAnsi="Arial"/>
+                <w:rFonts w:ascii="Amazon Ember" w:hAnsi="Amazon Ember"/>
                 <w:color w:val="16191F"/>
                 <w:sz w:val="19"/>
               </w:rPr>
@@ -6382,7 +6382,7 @@
           <w:p>
             <w:r>
               <w:rPr>
-                <w:rFonts w:ascii="Arial" w:hAnsi="Arial"/>
+                <w:rFonts w:ascii="Amazon Ember" w:hAnsi="Amazon Ember"/>
                 <w:color w:val="16191F"/>
                 <w:sz w:val="19"/>
               </w:rPr>
@@ -6400,7 +6400,7 @@
           <w:p>
             <w:r>
               <w:rPr>
-                <w:rFonts w:ascii="Arial" w:hAnsi="Arial"/>
+                <w:rFonts w:ascii="Amazon Ember" w:hAnsi="Amazon Ember"/>
                 <w:color w:val="16191F"/>
                 <w:sz w:val="19"/>
               </w:rPr>
@@ -6416,7 +6416,7 @@
           <w:p>
             <w:r>
               <w:rPr>
-                <w:rFonts w:ascii="Arial" w:hAnsi="Arial"/>
+                <w:rFonts w:ascii="Amazon Ember" w:hAnsi="Amazon Ember"/>
                 <w:color w:val="16191F"/>
                 <w:sz w:val="19"/>
               </w:rPr>
@@ -6432,7 +6432,7 @@
           <w:p>
             <w:r>
               <w:rPr>
-                <w:rFonts w:ascii="Arial" w:hAnsi="Arial"/>
+                <w:rFonts w:ascii="Amazon Ember" w:hAnsi="Amazon Ember"/>
                 <w:color w:val="16191F"/>
                 <w:sz w:val="19"/>
               </w:rPr>
@@ -6448,7 +6448,7 @@
           <w:p>
             <w:r>
               <w:rPr>
-                <w:rFonts w:ascii="Arial" w:hAnsi="Arial"/>
+                <w:rFonts w:ascii="Amazon Ember" w:hAnsi="Amazon Ember"/>
                 <w:color w:val="16191F"/>
                 <w:sz w:val="19"/>
               </w:rPr>
@@ -6464,7 +6464,7 @@
           <w:p>
             <w:r>
               <w:rPr>
-                <w:rFonts w:ascii="Arial" w:hAnsi="Arial"/>
+                <w:rFonts w:ascii="Amazon Ember" w:hAnsi="Amazon Ember"/>
                 <w:color w:val="16191F"/>
                 <w:sz w:val="19"/>
               </w:rPr>
@@ -6482,7 +6482,7 @@
           <w:p>
             <w:r>
               <w:rPr>
-                <w:rFonts w:ascii="Arial" w:hAnsi="Arial"/>
+                <w:rFonts w:ascii="Amazon Ember" w:hAnsi="Amazon Ember"/>
                 <w:color w:val="16191F"/>
                 <w:sz w:val="19"/>
               </w:rPr>
@@ -6498,7 +6498,7 @@
           <w:p>
             <w:r>
               <w:rPr>
-                <w:rFonts w:ascii="Arial" w:hAnsi="Arial"/>
+                <w:rFonts w:ascii="Amazon Ember" w:hAnsi="Amazon Ember"/>
                 <w:color w:val="16191F"/>
                 <w:sz w:val="19"/>
               </w:rPr>
@@ -6514,7 +6514,7 @@
           <w:p>
             <w:r>
               <w:rPr>
-                <w:rFonts w:ascii="Arial" w:hAnsi="Arial"/>
+                <w:rFonts w:ascii="Amazon Ember" w:hAnsi="Amazon Ember"/>
                 <w:color w:val="16191F"/>
                 <w:sz w:val="19"/>
               </w:rPr>
@@ -6530,7 +6530,7 @@
           <w:p>
             <w:r>
               <w:rPr>
-                <w:rFonts w:ascii="Arial" w:hAnsi="Arial"/>
+                <w:rFonts w:ascii="Amazon Ember" w:hAnsi="Amazon Ember"/>
                 <w:color w:val="16191F"/>
                 <w:sz w:val="19"/>
               </w:rPr>
@@ -6546,7 +6546,7 @@
           <w:p>
             <w:r>
               <w:rPr>
-                <w:rFonts w:ascii="Arial" w:hAnsi="Arial"/>
+                <w:rFonts w:ascii="Amazon Ember" w:hAnsi="Amazon Ember"/>
                 <w:color w:val="16191F"/>
                 <w:sz w:val="19"/>
               </w:rPr>
@@ -6564,7 +6564,7 @@
           <w:p>
             <w:r>
               <w:rPr>
-                <w:rFonts w:ascii="Arial" w:hAnsi="Arial"/>
+                <w:rFonts w:ascii="Amazon Ember" w:hAnsi="Amazon Ember"/>
                 <w:color w:val="16191F"/>
                 <w:sz w:val="19"/>
               </w:rPr>
@@ -6580,7 +6580,7 @@
           <w:p>
             <w:r>
               <w:rPr>
-                <w:rFonts w:ascii="Arial" w:hAnsi="Arial"/>
+                <w:rFonts w:ascii="Amazon Ember" w:hAnsi="Amazon Ember"/>
                 <w:color w:val="16191F"/>
                 <w:sz w:val="19"/>
               </w:rPr>
@@ -6596,7 +6596,7 @@
           <w:p>
             <w:r>
               <w:rPr>
-                <w:rFonts w:ascii="Arial" w:hAnsi="Arial"/>
+                <w:rFonts w:ascii="Amazon Ember" w:hAnsi="Amazon Ember"/>
                 <w:color w:val="16191F"/>
                 <w:sz w:val="19"/>
               </w:rPr>
@@ -6612,7 +6612,7 @@
           <w:p>
             <w:r>
               <w:rPr>
-                <w:rFonts w:ascii="Arial" w:hAnsi="Arial"/>
+                <w:rFonts w:ascii="Amazon Ember" w:hAnsi="Amazon Ember"/>
                 <w:color w:val="16191F"/>
                 <w:sz w:val="19"/>
               </w:rPr>
@@ -6628,7 +6628,7 @@
           <w:p>
             <w:r>
               <w:rPr>
-                <w:rFonts w:ascii="Arial" w:hAnsi="Arial"/>
+                <w:rFonts w:ascii="Amazon Ember" w:hAnsi="Amazon Ember"/>
                 <w:color w:val="16191F"/>
                 <w:sz w:val="19"/>
               </w:rPr>
@@ -6646,7 +6646,7 @@
           <w:p>
             <w:r>
               <w:rPr>
-                <w:rFonts w:ascii="Arial" w:hAnsi="Arial"/>
+                <w:rFonts w:ascii="Amazon Ember" w:hAnsi="Amazon Ember"/>
                 <w:color w:val="16191F"/>
                 <w:sz w:val="19"/>
               </w:rPr>
@@ -6662,7 +6662,7 @@
           <w:p>
             <w:r>
               <w:rPr>
-                <w:rFonts w:ascii="Arial" w:hAnsi="Arial"/>
+                <w:rFonts w:ascii="Amazon Ember" w:hAnsi="Amazon Ember"/>
                 <w:color w:val="16191F"/>
                 <w:sz w:val="19"/>
               </w:rPr>
@@ -6678,7 +6678,7 @@
           <w:p>
             <w:r>
               <w:rPr>
-                <w:rFonts w:ascii="Arial" w:hAnsi="Arial"/>
+                <w:rFonts w:ascii="Amazon Ember" w:hAnsi="Amazon Ember"/>
                 <w:color w:val="16191F"/>
                 <w:sz w:val="19"/>
               </w:rPr>
@@ -6694,7 +6694,7 @@
           <w:p>
             <w:r>
               <w:rPr>
-                <w:rFonts w:ascii="Arial" w:hAnsi="Arial"/>
+                <w:rFonts w:ascii="Amazon Ember" w:hAnsi="Amazon Ember"/>
                 <w:color w:val="16191F"/>
                 <w:sz w:val="19"/>
               </w:rPr>
@@ -6710,7 +6710,7 @@
           <w:p>
             <w:r>
               <w:rPr>
-                <w:rFonts w:ascii="Arial" w:hAnsi="Arial"/>
+                <w:rFonts w:ascii="Amazon Ember" w:hAnsi="Amazon Ember"/>
                 <w:color w:val="16191F"/>
                 <w:sz w:val="19"/>
               </w:rPr>
@@ -6728,7 +6728,7 @@
           <w:p>
             <w:r>
               <w:rPr>
-                <w:rFonts w:ascii="Arial" w:hAnsi="Arial"/>
+                <w:rFonts w:ascii="Amazon Ember" w:hAnsi="Amazon Ember"/>
                 <w:color w:val="16191F"/>
                 <w:sz w:val="19"/>
               </w:rPr>
@@ -6744,7 +6744,7 @@
           <w:p>
             <w:r>
               <w:rPr>
-                <w:rFonts w:ascii="Arial" w:hAnsi="Arial"/>
+                <w:rFonts w:ascii="Amazon Ember" w:hAnsi="Amazon Ember"/>
                 <w:color w:val="16191F"/>
                 <w:sz w:val="19"/>
               </w:rPr>
@@ -6760,7 +6760,7 @@
           <w:p>
             <w:r>
               <w:rPr>
-                <w:rFonts w:ascii="Arial" w:hAnsi="Arial"/>
+                <w:rFonts w:ascii="Amazon Ember" w:hAnsi="Amazon Ember"/>
                 <w:color w:val="16191F"/>
                 <w:sz w:val="19"/>
               </w:rPr>
@@ -6776,7 +6776,7 @@
           <w:p>
             <w:r>
               <w:rPr>
-                <w:rFonts w:ascii="Arial" w:hAnsi="Arial"/>
+                <w:rFonts w:ascii="Amazon Ember" w:hAnsi="Amazon Ember"/>
                 <w:color w:val="16191F"/>
                 <w:sz w:val="19"/>
               </w:rPr>
@@ -6792,7 +6792,7 @@
           <w:p>
             <w:r>
               <w:rPr>
-                <w:rFonts w:ascii="Arial" w:hAnsi="Arial"/>
+                <w:rFonts w:ascii="Amazon Ember" w:hAnsi="Amazon Ember"/>
                 <w:color w:val="16191F"/>
                 <w:sz w:val="19"/>
               </w:rPr>
@@ -6810,7 +6810,7 @@
           <w:p>
             <w:r>
               <w:rPr>
-                <w:rFonts w:ascii="Arial" w:hAnsi="Arial"/>
+                <w:rFonts w:ascii="Amazon Ember" w:hAnsi="Amazon Ember"/>
                 <w:color w:val="16191F"/>
                 <w:sz w:val="19"/>
               </w:rPr>
@@ -6826,7 +6826,7 @@
           <w:p>
             <w:r>
               <w:rPr>
-                <w:rFonts w:ascii="Arial" w:hAnsi="Arial"/>
+                <w:rFonts w:ascii="Amazon Ember" w:hAnsi="Amazon Ember"/>
                 <w:color w:val="16191F"/>
                 <w:sz w:val="19"/>
               </w:rPr>
@@ -6842,7 +6842,7 @@
           <w:p>
             <w:r>
               <w:rPr>
-                <w:rFonts w:ascii="Arial" w:hAnsi="Arial"/>
+                <w:rFonts w:ascii="Amazon Ember" w:hAnsi="Amazon Ember"/>
                 <w:color w:val="16191F"/>
                 <w:sz w:val="19"/>
               </w:rPr>
@@ -6858,7 +6858,7 @@
           <w:p>
             <w:r>
               <w:rPr>
-                <w:rFonts w:ascii="Arial" w:hAnsi="Arial"/>
+                <w:rFonts w:ascii="Amazon Ember" w:hAnsi="Amazon Ember"/>
                 <w:color w:val="16191F"/>
                 <w:sz w:val="19"/>
               </w:rPr>
@@ -6874,7 +6874,7 @@
           <w:p>
             <w:r>
               <w:rPr>
-                <w:rFonts w:ascii="Arial" w:hAnsi="Arial"/>
+                <w:rFonts w:ascii="Amazon Ember" w:hAnsi="Amazon Ember"/>
                 <w:color w:val="16191F"/>
                 <w:sz w:val="19"/>
               </w:rPr>
@@ -6892,7 +6892,7 @@
           <w:p>
             <w:r>
               <w:rPr>
-                <w:rFonts w:ascii="Arial" w:hAnsi="Arial"/>
+                <w:rFonts w:ascii="Amazon Ember" w:hAnsi="Amazon Ember"/>
                 <w:color w:val="16191F"/>
                 <w:sz w:val="19"/>
               </w:rPr>
@@ -6908,7 +6908,7 @@
           <w:p>
             <w:r>
               <w:rPr>
-                <w:rFonts w:ascii="Arial" w:hAnsi="Arial"/>
+                <w:rFonts w:ascii="Amazon Ember" w:hAnsi="Amazon Ember"/>
                 <w:color w:val="16191F"/>
                 <w:sz w:val="19"/>
               </w:rPr>
@@ -6924,7 +6924,7 @@
           <w:p>
             <w:r>
               <w:rPr>
-                <w:rFonts w:ascii="Arial" w:hAnsi="Arial"/>
+                <w:rFonts w:ascii="Amazon Ember" w:hAnsi="Amazon Ember"/>
                 <w:color w:val="16191F"/>
                 <w:sz w:val="19"/>
               </w:rPr>
@@ -6940,7 +6940,7 @@
           <w:p>
             <w:r>
               <w:rPr>
-                <w:rFonts w:ascii="Arial" w:hAnsi="Arial"/>
+                <w:rFonts w:ascii="Amazon Ember" w:hAnsi="Amazon Ember"/>
                 <w:color w:val="16191F"/>
                 <w:sz w:val="19"/>
               </w:rPr>
@@ -6956,7 +6956,7 @@
           <w:p>
             <w:r>
               <w:rPr>
-                <w:rFonts w:ascii="Arial" w:hAnsi="Arial"/>
+                <w:rFonts w:ascii="Amazon Ember" w:hAnsi="Amazon Ember"/>
                 <w:color w:val="16191F"/>
                 <w:sz w:val="19"/>
               </w:rPr>
@@ -6974,7 +6974,7 @@
           <w:p>
             <w:r>
               <w:rPr>
-                <w:rFonts w:ascii="Arial" w:hAnsi="Arial"/>
+                <w:rFonts w:ascii="Amazon Ember" w:hAnsi="Amazon Ember"/>
                 <w:color w:val="16191F"/>
                 <w:sz w:val="19"/>
               </w:rPr>
@@ -6990,7 +6990,7 @@
           <w:p>
             <w:r>
               <w:rPr>
-                <w:rFonts w:ascii="Arial" w:hAnsi="Arial"/>
+                <w:rFonts w:ascii="Amazon Ember" w:hAnsi="Amazon Ember"/>
                 <w:color w:val="16191F"/>
                 <w:sz w:val="19"/>
               </w:rPr>
@@ -7006,7 +7006,7 @@
           <w:p>
             <w:r>
               <w:rPr>
-                <w:rFonts w:ascii="Arial" w:hAnsi="Arial"/>
+                <w:rFonts w:ascii="Amazon Ember" w:hAnsi="Amazon Ember"/>
                 <w:color w:val="16191F"/>
                 <w:sz w:val="19"/>
               </w:rPr>
@@ -7022,7 +7022,7 @@
           <w:p>
             <w:r>
               <w:rPr>
-                <w:rFonts w:ascii="Arial" w:hAnsi="Arial"/>
+                <w:rFonts w:ascii="Amazon Ember" w:hAnsi="Amazon Ember"/>
                 <w:color w:val="16191F"/>
                 <w:sz w:val="19"/>
               </w:rPr>
@@ -7038,7 +7038,7 @@
           <w:p>
             <w:r>
               <w:rPr>
-                <w:rFonts w:ascii="Arial" w:hAnsi="Arial"/>
+                <w:rFonts w:ascii="Amazon Ember" w:hAnsi="Amazon Ember"/>
                 <w:color w:val="16191F"/>
                 <w:sz w:val="19"/>
               </w:rPr>
@@ -7056,7 +7056,7 @@
           <w:p>
             <w:r>
               <w:rPr>
-                <w:rFonts w:ascii="Arial" w:hAnsi="Arial"/>
+                <w:rFonts w:ascii="Amazon Ember" w:hAnsi="Amazon Ember"/>
                 <w:color w:val="16191F"/>
                 <w:sz w:val="19"/>
               </w:rPr>
@@ -7072,7 +7072,7 @@
           <w:p>
             <w:r>
               <w:rPr>
-                <w:rFonts w:ascii="Arial" w:hAnsi="Arial"/>
+                <w:rFonts w:ascii="Amazon Ember" w:hAnsi="Amazon Ember"/>
                 <w:color w:val="16191F"/>
                 <w:sz w:val="19"/>
               </w:rPr>
@@ -7088,7 +7088,7 @@
           <w:p>
             <w:r>
               <w:rPr>
-                <w:rFonts w:ascii="Arial" w:hAnsi="Arial"/>
+                <w:rFonts w:ascii="Amazon Ember" w:hAnsi="Amazon Ember"/>
                 <w:color w:val="16191F"/>
                 <w:sz w:val="19"/>
               </w:rPr>
@@ -7104,7 +7104,7 @@
           <w:p>
             <w:r>
               <w:rPr>
-                <w:rFonts w:ascii="Arial" w:hAnsi="Arial"/>
+                <w:rFonts w:ascii="Amazon Ember" w:hAnsi="Amazon Ember"/>
                 <w:color w:val="16191F"/>
                 <w:sz w:val="19"/>
               </w:rPr>
@@ -7120,7 +7120,7 @@
           <w:p>
             <w:r>
               <w:rPr>
-                <w:rFonts w:ascii="Arial" w:hAnsi="Arial"/>
+                <w:rFonts w:ascii="Amazon Ember" w:hAnsi="Amazon Ember"/>
                 <w:color w:val="16191F"/>
                 <w:sz w:val="19"/>
               </w:rPr>
@@ -7138,7 +7138,7 @@
           <w:p>
             <w:r>
               <w:rPr>
-                <w:rFonts w:ascii="Arial" w:hAnsi="Arial"/>
+                <w:rFonts w:ascii="Amazon Ember" w:hAnsi="Amazon Ember"/>
                 <w:color w:val="16191F"/>
                 <w:sz w:val="19"/>
               </w:rPr>
@@ -7154,7 +7154,7 @@
           <w:p>
             <w:r>
               <w:rPr>
-                <w:rFonts w:ascii="Arial" w:hAnsi="Arial"/>
+                <w:rFonts w:ascii="Amazon Ember" w:hAnsi="Amazon Ember"/>
                 <w:color w:val="16191F"/>
                 <w:sz w:val="19"/>
               </w:rPr>
@@ -7170,7 +7170,7 @@
           <w:p>
             <w:r>
               <w:rPr>
-                <w:rFonts w:ascii="Arial" w:hAnsi="Arial"/>
+                <w:rFonts w:ascii="Amazon Ember" w:hAnsi="Amazon Ember"/>
                 <w:color w:val="16191F"/>
                 <w:sz w:val="19"/>
               </w:rPr>
@@ -7186,7 +7186,7 @@
           <w:p>
             <w:r>
               <w:rPr>
-                <w:rFonts w:ascii="Arial" w:hAnsi="Arial"/>
+                <w:rFonts w:ascii="Amazon Ember" w:hAnsi="Amazon Ember"/>
                 <w:color w:val="16191F"/>
                 <w:sz w:val="19"/>
               </w:rPr>
@@ -7202,7 +7202,7 @@
           <w:p>
             <w:r>
               <w:rPr>
-                <w:rFonts w:ascii="Arial" w:hAnsi="Arial"/>
+                <w:rFonts w:ascii="Amazon Ember" w:hAnsi="Amazon Ember"/>
                 <w:color w:val="16191F"/>
                 <w:sz w:val="19"/>
               </w:rPr>
@@ -7220,7 +7220,7 @@
           <w:p>
             <w:r>
               <w:rPr>
-                <w:rFonts w:ascii="Arial" w:hAnsi="Arial"/>
+                <w:rFonts w:ascii="Amazon Ember" w:hAnsi="Amazon Ember"/>
                 <w:color w:val="16191F"/>
                 <w:sz w:val="19"/>
               </w:rPr>
@@ -7236,7 +7236,7 @@
           <w:p>
             <w:r>
               <w:rPr>
-                <w:rFonts w:ascii="Arial" w:hAnsi="Arial"/>
+                <w:rFonts w:ascii="Amazon Ember" w:hAnsi="Amazon Ember"/>
                 <w:color w:val="16191F"/>
                 <w:sz w:val="19"/>
               </w:rPr>
@@ -7252,7 +7252,7 @@
           <w:p>
             <w:r>
               <w:rPr>
-                <w:rFonts w:ascii="Arial" w:hAnsi="Arial"/>
+                <w:rFonts w:ascii="Amazon Ember" w:hAnsi="Amazon Ember"/>
                 <w:color w:val="16191F"/>
                 <w:sz w:val="19"/>
               </w:rPr>
@@ -7268,7 +7268,7 @@
           <w:p>
             <w:r>
               <w:rPr>
-                <w:rFonts w:ascii="Arial" w:hAnsi="Arial"/>
+                <w:rFonts w:ascii="Amazon Ember" w:hAnsi="Amazon Ember"/>
                 <w:color w:val="16191F"/>
                 <w:sz w:val="19"/>
               </w:rPr>
@@ -7284,7 +7284,7 @@
           <w:p>
             <w:r>
               <w:rPr>
-                <w:rFonts w:ascii="Arial" w:hAnsi="Arial"/>
+                <w:rFonts w:ascii="Amazon Ember" w:hAnsi="Amazon Ember"/>
                 <w:color w:val="16191F"/>
                 <w:sz w:val="19"/>
               </w:rPr>
@@ -7302,7 +7302,7 @@
           <w:p>
             <w:r>
               <w:rPr>
-                <w:rFonts w:ascii="Arial" w:hAnsi="Arial"/>
+                <w:rFonts w:ascii="Amazon Ember" w:hAnsi="Amazon Ember"/>
                 <w:color w:val="16191F"/>
                 <w:sz w:val="19"/>
               </w:rPr>
@@ -7318,7 +7318,7 @@
           <w:p>
             <w:r>
               <w:rPr>
-                <w:rFonts w:ascii="Arial" w:hAnsi="Arial"/>
+                <w:rFonts w:ascii="Amazon Ember" w:hAnsi="Amazon Ember"/>
                 <w:color w:val="16191F"/>
                 <w:sz w:val="19"/>
               </w:rPr>
@@ -7334,7 +7334,7 @@
           <w:p>
             <w:r>
               <w:rPr>
-                <w:rFonts w:ascii="Arial" w:hAnsi="Arial"/>
+                <w:rFonts w:ascii="Amazon Ember" w:hAnsi="Amazon Ember"/>
                 <w:color w:val="16191F"/>
                 <w:sz w:val="19"/>
               </w:rPr>
@@ -7350,7 +7350,7 @@
           <w:p>
             <w:r>
               <w:rPr>
-                <w:rFonts w:ascii="Arial" w:hAnsi="Arial"/>
+                <w:rFonts w:ascii="Amazon Ember" w:hAnsi="Amazon Ember"/>
                 <w:color w:val="16191F"/>
                 <w:sz w:val="19"/>
               </w:rPr>
@@ -7366,7 +7366,7 @@
           <w:p>
             <w:r>
               <w:rPr>
-                <w:rFonts w:ascii="Arial" w:hAnsi="Arial"/>
+                <w:rFonts w:ascii="Amazon Ember" w:hAnsi="Amazon Ember"/>
                 <w:color w:val="16191F"/>
                 <w:sz w:val="19"/>
               </w:rPr>
@@ -7384,7 +7384,7 @@
           <w:p>
             <w:r>
               <w:rPr>
-                <w:rFonts w:ascii="Arial" w:hAnsi="Arial"/>
+                <w:rFonts w:ascii="Amazon Ember" w:hAnsi="Amazon Ember"/>
                 <w:color w:val="16191F"/>
                 <w:sz w:val="19"/>
               </w:rPr>
@@ -7400,7 +7400,7 @@
           <w:p>
             <w:r>
               <w:rPr>
-                <w:rFonts w:ascii="Arial" w:hAnsi="Arial"/>
+                <w:rFonts w:ascii="Amazon Ember" w:hAnsi="Amazon Ember"/>
                 <w:color w:val="16191F"/>
                 <w:sz w:val="19"/>
               </w:rPr>
@@ -7416,7 +7416,7 @@
           <w:p>
             <w:r>
               <w:rPr>
-                <w:rFonts w:ascii="Arial" w:hAnsi="Arial"/>
+                <w:rFonts w:ascii="Amazon Ember" w:hAnsi="Amazon Ember"/>
                 <w:color w:val="16191F"/>
                 <w:sz w:val="19"/>
               </w:rPr>
@@ -7432,7 +7432,7 @@
           <w:p>
             <w:r>
               <w:rPr>
-                <w:rFonts w:ascii="Arial" w:hAnsi="Arial"/>
+                <w:rFonts w:ascii="Amazon Ember" w:hAnsi="Amazon Ember"/>
                 <w:color w:val="16191F"/>
                 <w:sz w:val="19"/>
               </w:rPr>
@@ -7448,7 +7448,7 @@
           <w:p>
             <w:r>
               <w:rPr>
-                <w:rFonts w:ascii="Arial" w:hAnsi="Arial"/>
+                <w:rFonts w:ascii="Amazon Ember" w:hAnsi="Amazon Ember"/>
                 <w:color w:val="16191F"/>
                 <w:sz w:val="19"/>
               </w:rPr>
@@ -7466,7 +7466,7 @@
           <w:p>
             <w:r>
               <w:rPr>
-                <w:rFonts w:ascii="Arial" w:hAnsi="Arial"/>
+                <w:rFonts w:ascii="Amazon Ember" w:hAnsi="Amazon Ember"/>
                 <w:color w:val="16191F"/>
                 <w:sz w:val="19"/>
               </w:rPr>
@@ -7482,7 +7482,7 @@
           <w:p>
             <w:r>
               <w:rPr>
-                <w:rFonts w:ascii="Arial" w:hAnsi="Arial"/>
+                <w:rFonts w:ascii="Amazon Ember" w:hAnsi="Amazon Ember"/>
                 <w:color w:val="16191F"/>
                 <w:sz w:val="19"/>
               </w:rPr>
@@ -7498,7 +7498,7 @@
           <w:p>
             <w:r>
               <w:rPr>
-                <w:rFonts w:ascii="Arial" w:hAnsi="Arial"/>
+                <w:rFonts w:ascii="Amazon Ember" w:hAnsi="Amazon Ember"/>
                 <w:color w:val="16191F"/>
                 <w:sz w:val="19"/>
               </w:rPr>
@@ -7514,7 +7514,7 @@
           <w:p>
             <w:r>
               <w:rPr>
-                <w:rFonts w:ascii="Arial" w:hAnsi="Arial"/>
+                <w:rFonts w:ascii="Amazon Ember" w:hAnsi="Amazon Ember"/>
                 <w:color w:val="16191F"/>
                 <w:sz w:val="19"/>
               </w:rPr>
@@ -7530,7 +7530,7 @@
           <w:p>
             <w:r>
               <w:rPr>
-                <w:rFonts w:ascii="Arial" w:hAnsi="Arial"/>
+                <w:rFonts w:ascii="Amazon Ember" w:hAnsi="Amazon Ember"/>
                 <w:color w:val="16191F"/>
                 <w:sz w:val="19"/>
               </w:rPr>
@@ -7548,7 +7548,7 @@
           <w:p>
             <w:r>
               <w:rPr>
-                <w:rFonts w:ascii="Arial" w:hAnsi="Arial"/>
+                <w:rFonts w:ascii="Amazon Ember" w:hAnsi="Amazon Ember"/>
                 <w:color w:val="16191F"/>
                 <w:sz w:val="19"/>
               </w:rPr>
@@ -7564,7 +7564,7 @@
           <w:p>
             <w:r>
               <w:rPr>
-                <w:rFonts w:ascii="Arial" w:hAnsi="Arial"/>
+                <w:rFonts w:ascii="Amazon Ember" w:hAnsi="Amazon Ember"/>
                 <w:color w:val="16191F"/>
                 <w:sz w:val="19"/>
               </w:rPr>
@@ -7580,7 +7580,7 @@
           <w:p>
             <w:r>
               <w:rPr>
-                <w:rFonts w:ascii="Arial" w:hAnsi="Arial"/>
+                <w:rFonts w:ascii="Amazon Ember" w:hAnsi="Amazon Ember"/>
                 <w:color w:val="16191F"/>
                 <w:sz w:val="19"/>
               </w:rPr>
@@ -7596,7 +7596,7 @@
           <w:p>
             <w:r>
               <w:rPr>
-                <w:rFonts w:ascii="Arial" w:hAnsi="Arial"/>
+                <w:rFonts w:ascii="Amazon Ember" w:hAnsi="Amazon Ember"/>
                 <w:color w:val="16191F"/>
                 <w:sz w:val="19"/>
               </w:rPr>
@@ -7612,7 +7612,7 @@
           <w:p>
             <w:r>
               <w:rPr>
-                <w:rFonts w:ascii="Arial" w:hAnsi="Arial"/>
+                <w:rFonts w:ascii="Amazon Ember" w:hAnsi="Amazon Ember"/>
                 <w:color w:val="16191F"/>
                 <w:sz w:val="19"/>
               </w:rPr>
@@ -7630,7 +7630,7 @@
           <w:p>
             <w:r>
               <w:rPr>
-                <w:rFonts w:ascii="Arial" w:hAnsi="Arial"/>
+                <w:rFonts w:ascii="Amazon Ember" w:hAnsi="Amazon Ember"/>
                 <w:color w:val="16191F"/>
                 <w:sz w:val="19"/>
               </w:rPr>
@@ -7646,7 +7646,7 @@
           <w:p>
             <w:r>
               <w:rPr>
-                <w:rFonts w:ascii="Arial" w:hAnsi="Arial"/>
+                <w:rFonts w:ascii="Amazon Ember" w:hAnsi="Amazon Ember"/>
                 <w:color w:val="16191F"/>
                 <w:sz w:val="19"/>
               </w:rPr>
@@ -7662,7 +7662,7 @@
           <w:p>
             <w:r>
               <w:rPr>
-                <w:rFonts w:ascii="Arial" w:hAnsi="Arial"/>
+                <w:rFonts w:ascii="Amazon Ember" w:hAnsi="Amazon Ember"/>
                 <w:color w:val="16191F"/>
                 <w:sz w:val="19"/>
               </w:rPr>
@@ -7678,7 +7678,7 @@
           <w:p>
             <w:r>
               <w:rPr>
-                <w:rFonts w:ascii="Arial" w:hAnsi="Arial"/>
+                <w:rFonts w:ascii="Amazon Ember" w:hAnsi="Amazon Ember"/>
                 <w:color w:val="16191F"/>
                 <w:sz w:val="19"/>
               </w:rPr>
@@ -7694,7 +7694,7 @@
           <w:p>
             <w:r>
               <w:rPr>
-                <w:rFonts w:ascii="Arial" w:hAnsi="Arial"/>
+                <w:rFonts w:ascii="Amazon Ember" w:hAnsi="Amazon Ember"/>
                 <w:color w:val="16191F"/>
                 <w:sz w:val="19"/>
               </w:rPr>
@@ -7712,7 +7712,7 @@
           <w:p>
             <w:r>
               <w:rPr>
-                <w:rFonts w:ascii="Arial" w:hAnsi="Arial"/>
+                <w:rFonts w:ascii="Amazon Ember" w:hAnsi="Amazon Ember"/>
                 <w:color w:val="16191F"/>
                 <w:sz w:val="19"/>
               </w:rPr>
@@ -7728,7 +7728,7 @@
           <w:p>
             <w:r>
               <w:rPr>
-                <w:rFonts w:ascii="Arial" w:hAnsi="Arial"/>
+                <w:rFonts w:ascii="Amazon Ember" w:hAnsi="Amazon Ember"/>
                 <w:color w:val="16191F"/>
                 <w:sz w:val="19"/>
               </w:rPr>
@@ -7744,7 +7744,7 @@
           <w:p>
             <w:r>
               <w:rPr>
-                <w:rFonts w:ascii="Arial" w:hAnsi="Arial"/>
+                <w:rFonts w:ascii="Amazon Ember" w:hAnsi="Amazon Ember"/>
                 <w:color w:val="16191F"/>
                 <w:sz w:val="19"/>
               </w:rPr>
@@ -7760,7 +7760,7 @@
           <w:p>
             <w:r>
               <w:rPr>
-                <w:rFonts w:ascii="Arial" w:hAnsi="Arial"/>
+                <w:rFonts w:ascii="Amazon Ember" w:hAnsi="Amazon Ember"/>
                 <w:color w:val="16191F"/>
                 <w:sz w:val="19"/>
               </w:rPr>
@@ -7776,7 +7776,7 @@
           <w:p>
             <w:r>
               <w:rPr>
-                <w:rFonts w:ascii="Arial" w:hAnsi="Arial"/>
+                <w:rFonts w:ascii="Amazon Ember" w:hAnsi="Amazon Ember"/>
                 <w:color w:val="16191F"/>
                 <w:sz w:val="19"/>
               </w:rPr>
@@ -7794,7 +7794,7 @@
           <w:p>
             <w:r>
               <w:rPr>
-                <w:rFonts w:ascii="Arial" w:hAnsi="Arial"/>
+                <w:rFonts w:ascii="Amazon Ember" w:hAnsi="Amazon Ember"/>
                 <w:color w:val="16191F"/>
                 <w:sz w:val="19"/>
               </w:rPr>
@@ -7810,7 +7810,7 @@
           <w:p>
             <w:r>
               <w:rPr>
-                <w:rFonts w:ascii="Arial" w:hAnsi="Arial"/>
+                <w:rFonts w:ascii="Amazon Ember" w:hAnsi="Amazon Ember"/>
                 <w:color w:val="16191F"/>
                 <w:sz w:val="19"/>
               </w:rPr>
@@ -7826,7 +7826,7 @@
           <w:p>
             <w:r>
               <w:rPr>
-                <w:rFonts w:ascii="Arial" w:hAnsi="Arial"/>
+                <w:rFonts w:ascii="Amazon Ember" w:hAnsi="Amazon Ember"/>
                 <w:color w:val="16191F"/>
                 <w:sz w:val="19"/>
               </w:rPr>
@@ -7842,7 +7842,7 @@
           <w:p>
             <w:r>
               <w:rPr>
-                <w:rFonts w:ascii="Arial" w:hAnsi="Arial"/>
+                <w:rFonts w:ascii="Amazon Ember" w:hAnsi="Amazon Ember"/>
                 <w:color w:val="16191F"/>
                 <w:sz w:val="19"/>
               </w:rPr>
@@ -7858,7 +7858,7 @@
           <w:p>
             <w:r>
               <w:rPr>
-                <w:rFonts w:ascii="Arial" w:hAnsi="Arial"/>
+                <w:rFonts w:ascii="Amazon Ember" w:hAnsi="Amazon Ember"/>
                 <w:color w:val="16191F"/>
                 <w:sz w:val="19"/>
               </w:rPr>
@@ -7876,7 +7876,7 @@
           <w:p>
             <w:r>
               <w:rPr>
-                <w:rFonts w:ascii="Arial" w:hAnsi="Arial"/>
+                <w:rFonts w:ascii="Amazon Ember" w:hAnsi="Amazon Ember"/>
                 <w:color w:val="16191F"/>
                 <w:sz w:val="19"/>
               </w:rPr>
@@ -7892,7 +7892,7 @@
           <w:p>
             <w:r>
               <w:rPr>
-                <w:rFonts w:ascii="Arial" w:hAnsi="Arial"/>
+                <w:rFonts w:ascii="Amazon Ember" w:hAnsi="Amazon Ember"/>
                 <w:color w:val="16191F"/>
                 <w:sz w:val="19"/>
               </w:rPr>
@@ -7908,7 +7908,7 @@
           <w:p>
             <w:r>
               <w:rPr>
-                <w:rFonts w:ascii="Arial" w:hAnsi="Arial"/>
+                <w:rFonts w:ascii="Amazon Ember" w:hAnsi="Amazon Ember"/>
                 <w:color w:val="16191F"/>
                 <w:sz w:val="19"/>
               </w:rPr>
@@ -7924,7 +7924,7 @@
           <w:p>
             <w:r>
               <w:rPr>
-                <w:rFonts w:ascii="Arial" w:hAnsi="Arial"/>
+                <w:rFonts w:ascii="Amazon Ember" w:hAnsi="Amazon Ember"/>
                 <w:color w:val="16191F"/>
                 <w:sz w:val="19"/>
               </w:rPr>
@@ -7940,7 +7940,7 @@
           <w:p>
             <w:r>
               <w:rPr>
-                <w:rFonts w:ascii="Arial" w:hAnsi="Arial"/>
+                <w:rFonts w:ascii="Amazon Ember" w:hAnsi="Amazon Ember"/>
                 <w:color w:val="16191F"/>
                 <w:sz w:val="19"/>
               </w:rPr>
@@ -7958,7 +7958,7 @@
           <w:p>
             <w:r>
               <w:rPr>
-                <w:rFonts w:ascii="Arial" w:hAnsi="Arial"/>
+                <w:rFonts w:ascii="Amazon Ember" w:hAnsi="Amazon Ember"/>
                 <w:color w:val="16191F"/>
                 <w:sz w:val="19"/>
               </w:rPr>
@@ -7974,7 +7974,7 @@
           <w:p>
             <w:r>
               <w:rPr>
-                <w:rFonts w:ascii="Arial" w:hAnsi="Arial"/>
+                <w:rFonts w:ascii="Amazon Ember" w:hAnsi="Amazon Ember"/>
                 <w:color w:val="16191F"/>
                 <w:sz w:val="19"/>
               </w:rPr>
@@ -7990,7 +7990,7 @@
           <w:p>
             <w:r>
               <w:rPr>
-                <w:rFonts w:ascii="Arial" w:hAnsi="Arial"/>
+                <w:rFonts w:ascii="Amazon Ember" w:hAnsi="Amazon Ember"/>
                 <w:color w:val="16191F"/>
                 <w:sz w:val="19"/>
               </w:rPr>
@@ -8006,7 +8006,7 @@
           <w:p>
             <w:r>
               <w:rPr>
-                <w:rFonts w:ascii="Arial" w:hAnsi="Arial"/>
+                <w:rFonts w:ascii="Amazon Ember" w:hAnsi="Amazon Ember"/>
                 <w:color w:val="16191F"/>
                 <w:sz w:val="19"/>
               </w:rPr>
@@ -8022,7 +8022,7 @@
           <w:p>
             <w:r>
               <w:rPr>
-                <w:rFonts w:ascii="Arial" w:hAnsi="Arial"/>
+                <w:rFonts w:ascii="Amazon Ember" w:hAnsi="Amazon Ember"/>
                 <w:color w:val="16191F"/>
                 <w:sz w:val="19"/>
               </w:rPr>
@@ -8044,7 +8044,7 @@
       </w:pPr>
       <w:r>
         <w:rPr>
-          <w:rFonts w:ascii="Arial" w:hAnsi="Arial"/>
+          <w:rFonts w:ascii="Amazon Ember" w:hAnsi="Amazon Ember"/>
           <w:b/>
           <w:color w:val="0972D3"/>
           <w:sz w:val="28"/>
@@ -8058,7 +8058,7 @@
       </w:pPr>
       <w:r>
         <w:rPr>
-          <w:rFonts w:ascii="Arial" w:hAnsi="Arial"/>
+          <w:rFonts w:ascii="Amazon Ember" w:hAnsi="Amazon Ember"/>
           <w:i/>
           <w:color w:val="545B64"/>
           <w:sz w:val="20"/>
@@ -8072,7 +8072,7 @@
       </w:pPr>
       <w:r>
         <w:rPr>
-          <w:rFonts w:ascii="Arial" w:hAnsi="Arial"/>
+          <w:rFonts w:ascii="Amazon Ember" w:hAnsi="Amazon Ember"/>
           <w:color w:val="16191F"/>
           <w:sz w:val="21"/>
         </w:rPr>
@@ -8085,7 +8085,7 @@
       </w:pPr>
       <w:r>
         <w:rPr>
-          <w:rFonts w:ascii="Arial" w:hAnsi="Arial"/>
+          <w:rFonts w:ascii="Amazon Ember" w:hAnsi="Amazon Ember"/>
           <w:i/>
           <w:color w:val="545B64"/>
           <w:sz w:val="20"/>
@@ -8099,7 +8099,7 @@
       </w:pPr>
       <w:r>
         <w:rPr>
-          <w:rFonts w:ascii="Arial" w:hAnsi="Arial"/>
+          <w:rFonts w:ascii="Amazon Ember" w:hAnsi="Amazon Ember"/>
           <w:color w:val="16191F"/>
           <w:sz w:val="21"/>
         </w:rPr>
@@ -8112,7 +8112,7 @@
       </w:pPr>
       <w:r>
         <w:rPr>
-          <w:rFonts w:ascii="Arial" w:hAnsi="Arial"/>
+          <w:rFonts w:ascii="Amazon Ember" w:hAnsi="Amazon Ember"/>
           <w:i/>
           <w:color w:val="545B64"/>
           <w:sz w:val="20"/>
@@ -8126,7 +8126,7 @@
       </w:pPr>
       <w:r>
         <w:rPr>
-          <w:rFonts w:ascii="Arial" w:hAnsi="Arial"/>
+          <w:rFonts w:ascii="Amazon Ember" w:hAnsi="Amazon Ember"/>
           <w:i/>
           <w:color w:val="545B64"/>
           <w:sz w:val="20"/>
@@ -8140,7 +8140,7 @@
       </w:pPr>
       <w:r>
         <w:rPr>
-          <w:rFonts w:ascii="Arial" w:hAnsi="Arial"/>
+          <w:rFonts w:ascii="Amazon Ember" w:hAnsi="Amazon Ember"/>
           <w:i/>
           <w:color w:val="545B64"/>
           <w:sz w:val="20"/>
@@ -8154,7 +8154,7 @@
       </w:pPr>
       <w:r>
         <w:rPr>
-          <w:rFonts w:ascii="Arial" w:hAnsi="Arial"/>
+          <w:rFonts w:ascii="Amazon Ember" w:hAnsi="Amazon Ember"/>
           <w:color w:val="16191F"/>
           <w:sz w:val="21"/>
         </w:rPr>
@@ -8167,7 +8167,7 @@
       </w:pPr>
       <w:r>
         <w:rPr>
-          <w:rFonts w:ascii="Arial" w:hAnsi="Arial"/>
+          <w:rFonts w:ascii="Amazon Ember" w:hAnsi="Amazon Ember"/>
           <w:i/>
           <w:color w:val="545B64"/>
           <w:sz w:val="20"/>
@@ -8186,7 +8186,7 @@
       </w:pPr>
       <w:r>
         <w:rPr>
-          <w:rFonts w:ascii="Arial" w:hAnsi="Arial"/>
+          <w:rFonts w:ascii="Amazon Ember" w:hAnsi="Amazon Ember"/>
           <w:color w:val="16191F"/>
           <w:sz w:val="21"/>
         </w:rPr>
@@ -8199,7 +8199,7 @@
       </w:pPr>
       <w:r>
         <w:rPr>
-          <w:rFonts w:ascii="Arial" w:hAnsi="Arial"/>
+          <w:rFonts w:ascii="Amazon Ember" w:hAnsi="Amazon Ember"/>
           <w:color w:val="16191F"/>
           <w:sz w:val="21"/>
         </w:rPr>

</xml_diff>